<commit_message>
writing the results in the draft, and include some figures from the workshop
</commit_message>
<xml_diff>
--- a/Documents/Workshop_survey_analysis.docx
+++ b/Documents/Workshop_survey_analysis.docx
@@ -1,6 +1,6 @@
 
 <file path=word/document.xml><?xml version="1.0" encoding="utf-8"?>
-<w:document xmlns:wpc="http://schemas.microsoft.com/office/word/2010/wordprocessingCanvas" xmlns:cx="http://schemas.microsoft.com/office/drawing/2014/chartex" xmlns:cx1="http://schemas.microsoft.com/office/drawing/2015/9/8/chartex" xmlns:cx2="http://schemas.microsoft.com/office/drawing/2015/10/21/chartex" xmlns:cx3="http://schemas.microsoft.com/office/drawing/2016/5/9/chartex" xmlns:cx4="http://schemas.microsoft.com/office/drawing/2016/5/10/chartex" xmlns:cx5="http://schemas.microsoft.com/office/drawing/2016/5/11/chartex" xmlns:cx6="http://schemas.microsoft.com/office/drawing/2016/5/12/chartex" xmlns:cx7="http://schemas.microsoft.com/office/drawing/2016/5/13/chartex" xmlns:cx8="http://schemas.microsoft.com/office/drawing/2016/5/14/chartex" xmlns:mc="http://schemas.openxmlformats.org/markup-compatibility/2006" xmlns:aink="http://schemas.microsoft.com/office/drawing/2016/ink" xmlns:am3d="http://schemas.microsoft.com/office/drawing/2017/model3d" xmlns:o="urn:schemas-microsoft-com:office:office" xmlns:oel="http://schemas.microsoft.com/office/2019/extlst" xmlns:r="http://schemas.openxmlformats.org/officeDocument/2006/relationships" xmlns:m="http://schemas.openxmlformats.org/officeDocument/2006/math" xmlns:v="urn:schemas-microsoft-com:vml" xmlns:wp14="http://schemas.microsoft.com/office/word/2010/wordprocessingDrawing" xmlns:wp="http://schemas.openxmlformats.org/drawingml/2006/wordprocessingDrawing" xmlns:w10="urn:schemas-microsoft-com:office:word" xmlns:w="http://schemas.openxmlformats.org/wordprocessingml/2006/main" xmlns:w14="http://schemas.microsoft.com/office/word/2010/wordml" xmlns:w15="http://schemas.microsoft.com/office/word/2012/wordml" xmlns:w16cex="http://schemas.microsoft.com/office/word/2018/wordml/cex" xmlns:w16cid="http://schemas.microsoft.com/office/word/2016/wordml/cid" xmlns:w16="http://schemas.microsoft.com/office/word/2018/wordml" xmlns:w16du="http://schemas.microsoft.com/office/word/2023/wordml/word16du" xmlns:w16sdtdh="http://schemas.microsoft.com/office/word/2020/wordml/sdtdatahash" xmlns:w16se="http://schemas.microsoft.com/office/word/2015/wordml/symex" xmlns:wpg="http://schemas.microsoft.com/office/word/2010/wordprocessingGroup" xmlns:wpi="http://schemas.microsoft.com/office/word/2010/wordprocessingInk" xmlns:wne="http://schemas.microsoft.com/office/word/2006/wordml" xmlns:wps="http://schemas.microsoft.com/office/word/2010/wordprocessingShape" mc:Ignorable="w14 w15 w16se w16cid w16 w16cex w16sdtdh w16du wp14">
+<w:document xmlns:wpc="http://schemas.microsoft.com/office/word/2010/wordprocessingCanvas" xmlns:cx="http://schemas.microsoft.com/office/drawing/2014/chartex" xmlns:cx1="http://schemas.microsoft.com/office/drawing/2015/9/8/chartex" xmlns:cx2="http://schemas.microsoft.com/office/drawing/2015/10/21/chartex" xmlns:cx3="http://schemas.microsoft.com/office/drawing/2016/5/9/chartex" xmlns:cx4="http://schemas.microsoft.com/office/drawing/2016/5/10/chartex" xmlns:cx5="http://schemas.microsoft.com/office/drawing/2016/5/11/chartex" xmlns:cx6="http://schemas.microsoft.com/office/drawing/2016/5/12/chartex" xmlns:cx7="http://schemas.microsoft.com/office/drawing/2016/5/13/chartex" xmlns:cx8="http://schemas.microsoft.com/office/drawing/2016/5/14/chartex" xmlns:mc="http://schemas.openxmlformats.org/markup-compatibility/2006" xmlns:aink="http://schemas.microsoft.com/office/drawing/2016/ink" xmlns:am3d="http://schemas.microsoft.com/office/drawing/2017/model3d" xmlns:o="urn:schemas-microsoft-com:office:office" xmlns:oel="http://schemas.microsoft.com/office/2019/extlst" xmlns:r="http://schemas.openxmlformats.org/officeDocument/2006/relationships" xmlns:m="http://schemas.openxmlformats.org/officeDocument/2006/math" xmlns:v="urn:schemas-microsoft-com:vml" xmlns:wp14="http://schemas.microsoft.com/office/word/2010/wordprocessingDrawing" xmlns:wp="http://schemas.openxmlformats.org/drawingml/2006/wordprocessingDrawing" xmlns:w10="urn:schemas-microsoft-com:office:word" xmlns:w="http://schemas.openxmlformats.org/wordprocessingml/2006/main" xmlns:w14="http://schemas.microsoft.com/office/word/2010/wordml" xmlns:w15="http://schemas.microsoft.com/office/word/2012/wordml" xmlns:w16cex="http://schemas.microsoft.com/office/word/2018/wordml/cex" xmlns:w16cid="http://schemas.microsoft.com/office/word/2016/wordml/cid" xmlns:w16="http://schemas.microsoft.com/office/word/2018/wordml" xmlns:w16du="http://schemas.microsoft.com/office/word/2023/wordml/word16du" xmlns:w16sdtdh="http://schemas.microsoft.com/office/word/2020/wordml/sdtdatahash" xmlns:w16sdtfl="http://schemas.microsoft.com/office/word/2024/wordml/sdtformatlock" xmlns:w16se="http://schemas.microsoft.com/office/word/2015/wordml/symex" xmlns:wpg="http://schemas.microsoft.com/office/word/2010/wordprocessingGroup" xmlns:wpi="http://schemas.microsoft.com/office/word/2010/wordprocessingInk" xmlns:wne="http://schemas.microsoft.com/office/word/2006/wordml" xmlns:wps="http://schemas.microsoft.com/office/word/2010/wordprocessingShape" mc:Ignorable="w14 w15 w16se w16cid w16 w16cex w16sdtdh w16sdtfl w16du wp14">
   <w:body>
     <w:p>
       <w:pPr>
@@ -679,7 +679,17 @@
           <w:sz w:val="22"/>
           <w:szCs w:val="22"/>
         </w:rPr>
-        <w:t xml:space="preserve">We obtained responses from 15 fishers, 58% male and 41.7% female, demonstrating significant and equal participation by both genders in Caye Caulker's fishing </w:t>
+        <w:t xml:space="preserve">We obtained responses from 15 fishers, </w:t>
+      </w:r>
+      <w:bookmarkStart w:id="0" w:name="_Hlk187160817"/>
+      <w:r>
+        <w:rPr>
+          <w:rFonts w:eastAsiaTheme="minorHAnsi" w:cstheme="minorBidi"/>
+          <w:color w:val="auto"/>
+          <w:sz w:val="22"/>
+          <w:szCs w:val="22"/>
+        </w:rPr>
+        <w:t xml:space="preserve">58% male and 41.7% female, demonstrating significant and equal participation by both genders in Caye Caulker's fishing </w:t>
       </w:r>
       <w:r>
         <w:rPr>
@@ -690,6 +700,7 @@
         </w:rPr>
         <w:t>activity</w:t>
       </w:r>
+      <w:bookmarkEnd w:id="0"/>
       <w:r>
         <w:rPr>
           <w:rFonts w:eastAsiaTheme="minorHAnsi" w:cstheme="minorBidi"/>
@@ -734,10 +745,12 @@
         <w:pStyle w:val="Heading3"/>
         <w:jc w:val="both"/>
       </w:pPr>
+      <w:bookmarkStart w:id="1" w:name="_Hlk187164275"/>
       <w:r>
         <w:t>Lobster fishery</w:t>
       </w:r>
     </w:p>
+    <w:bookmarkEnd w:id="1"/>
     <w:p>
       <w:pPr>
         <w:jc w:val="both"/>
@@ -830,6 +843,9 @@
         <w:jc w:val="both"/>
       </w:pPr>
       <w:r>
+        <w:rPr>
+          <w:noProof/>
+        </w:rPr>
         <w:drawing>
           <wp:inline distT="0" distB="0" distL="0" distR="0" wp14:anchorId="0567751D" wp14:editId="47063AC6">
             <wp:extent cx="3829145" cy="2345415"/>
@@ -879,32 +895,19 @@
         <w:pStyle w:val="Caption"/>
         <w:jc w:val="both"/>
       </w:pPr>
-      <w:bookmarkStart w:id="0" w:name="_Ref181095135"/>
+      <w:bookmarkStart w:id="2" w:name="_Ref181095135"/>
       <w:r>
         <w:t xml:space="preserve">Figure </w:t>
       </w:r>
-      <w:r>
-        <w:fldChar w:fldCharType="begin"/>
-      </w:r>
-      <w:r>
-        <w:instrText xml:space="preserve"> SEQ Figure \* ARABIC </w:instrText>
-      </w:r>
-      <w:r>
-        <w:fldChar w:fldCharType="separate"/>
-      </w:r>
-      <w:r>
-        <w:rPr>
-          <w:noProof/>
-        </w:rPr>
-        <w:t>1</w:t>
-      </w:r>
-      <w:r>
-        <w:rPr>
-          <w:noProof/>
-        </w:rPr>
-        <w:fldChar w:fldCharType="end"/>
-      </w:r>
-      <w:bookmarkEnd w:id="0"/>
+      <w:fldSimple w:instr=" SEQ Figure \* ARABIC ">
+        <w:r>
+          <w:rPr>
+            <w:noProof/>
+          </w:rPr>
+          <w:t>1</w:t>
+        </w:r>
+      </w:fldSimple>
+      <w:bookmarkEnd w:id="2"/>
       <w:r>
         <w:t xml:space="preserve"> Fishing gear used in the spiny lobster fishery</w:t>
       </w:r>
@@ -1021,32 +1024,19 @@
         <w:pStyle w:val="Caption"/>
         <w:jc w:val="both"/>
       </w:pPr>
-      <w:bookmarkStart w:id="1" w:name="_Ref181096797"/>
+      <w:bookmarkStart w:id="3" w:name="_Ref181096797"/>
       <w:r>
         <w:t xml:space="preserve">Figure </w:t>
       </w:r>
-      <w:r>
-        <w:fldChar w:fldCharType="begin"/>
-      </w:r>
-      <w:r>
-        <w:instrText xml:space="preserve"> SEQ Figure \* ARABIC </w:instrText>
-      </w:r>
-      <w:r>
-        <w:fldChar w:fldCharType="separate"/>
-      </w:r>
-      <w:r>
-        <w:rPr>
-          <w:noProof/>
-        </w:rPr>
-        <w:t>2</w:t>
-      </w:r>
-      <w:r>
-        <w:rPr>
-          <w:noProof/>
-        </w:rPr>
-        <w:fldChar w:fldCharType="end"/>
-      </w:r>
-      <w:bookmarkEnd w:id="1"/>
+      <w:fldSimple w:instr=" SEQ Figure \* ARABIC ">
+        <w:r>
+          <w:rPr>
+            <w:noProof/>
+          </w:rPr>
+          <w:t>2</w:t>
+        </w:r>
+      </w:fldSimple>
+      <w:bookmarkEnd w:id="3"/>
       <w:r>
         <w:t xml:space="preserve"> Individual number of fishing trips per month for lobsters</w:t>
       </w:r>
@@ -1162,27 +1152,14 @@
       <w:r>
         <w:t xml:space="preserve">Table </w:t>
       </w:r>
-      <w:r>
-        <w:fldChar w:fldCharType="begin"/>
-      </w:r>
-      <w:r>
-        <w:instrText xml:space="preserve"> SEQ Table \* ARABIC </w:instrText>
-      </w:r>
-      <w:r>
-        <w:fldChar w:fldCharType="separate"/>
-      </w:r>
-      <w:r>
-        <w:rPr>
-          <w:noProof/>
-        </w:rPr>
-        <w:t>1</w:t>
-      </w:r>
-      <w:r>
-        <w:rPr>
-          <w:noProof/>
-        </w:rPr>
-        <w:fldChar w:fldCharType="end"/>
-      </w:r>
+      <w:fldSimple w:instr=" SEQ Table \* ARABIC ">
+        <w:r>
+          <w:rPr>
+            <w:noProof/>
+          </w:rPr>
+          <w:t>1</w:t>
+        </w:r>
+      </w:fldSimple>
       <w:r>
         <w:t xml:space="preserve"> Summary of responses in the lobster fishery. All data were reported by fishers. Catch values are in pounds. Cost and sell prices in Belize dollars.</w:t>
       </w:r>
@@ -3871,32 +3848,19 @@
         <w:pStyle w:val="Caption"/>
         <w:jc w:val="both"/>
       </w:pPr>
-      <w:bookmarkStart w:id="2" w:name="_Ref181177558"/>
+      <w:bookmarkStart w:id="4" w:name="_Ref181177558"/>
       <w:r>
         <w:t xml:space="preserve">Figure </w:t>
       </w:r>
-      <w:r>
-        <w:fldChar w:fldCharType="begin"/>
-      </w:r>
-      <w:r>
-        <w:instrText xml:space="preserve"> SEQ Figure \* ARABIC </w:instrText>
-      </w:r>
-      <w:r>
-        <w:fldChar w:fldCharType="separate"/>
-      </w:r>
-      <w:r>
-        <w:rPr>
-          <w:noProof/>
-        </w:rPr>
-        <w:t>3</w:t>
-      </w:r>
-      <w:r>
-        <w:rPr>
-          <w:noProof/>
-        </w:rPr>
-        <w:fldChar w:fldCharType="end"/>
-      </w:r>
-      <w:bookmarkEnd w:id="2"/>
+      <w:fldSimple w:instr=" SEQ Figure \* ARABIC ">
+        <w:r>
+          <w:rPr>
+            <w:noProof/>
+          </w:rPr>
+          <w:t>3</w:t>
+        </w:r>
+      </w:fldSimple>
+      <w:bookmarkEnd w:id="4"/>
       <w:r>
         <w:t xml:space="preserve"> Relation between the number of fishing trips during lobster season and the cost per trip reported by participants</w:t>
       </w:r>
@@ -3905,6 +3869,7 @@
       <w:pPr>
         <w:jc w:val="both"/>
       </w:pPr>
+      <w:bookmarkStart w:id="5" w:name="_Hlk189508981"/>
       <w:r>
         <w:t>As explained by several fishermen during the activity, the best catches are made in the first two months</w:t>
       </w:r>
@@ -3940,7 +3905,11 @@
       </w:r>
       <w:proofErr w:type="spellEnd"/>
       <w:r>
-        <w:t xml:space="preserve"> per fishing trip considering the different catch between months during the season. </w:t>
+        <w:t xml:space="preserve"> per fishing trip considering the different catch between months during the season.</w:t>
+      </w:r>
+      <w:bookmarkEnd w:id="5"/>
+      <w:r>
+        <w:t xml:space="preserve"> </w:t>
       </w:r>
     </w:p>
     <w:p>
@@ -4086,27 +4055,14 @@
       <w:r>
         <w:t xml:space="preserve">Table </w:t>
       </w:r>
-      <w:r>
-        <w:fldChar w:fldCharType="begin"/>
-      </w:r>
-      <w:r>
-        <w:instrText xml:space="preserve"> SEQ Table \* ARABIC </w:instrText>
-      </w:r>
-      <w:r>
-        <w:fldChar w:fldCharType="separate"/>
-      </w:r>
-      <w:r>
-        <w:rPr>
-          <w:noProof/>
-        </w:rPr>
-        <w:t>2</w:t>
-      </w:r>
-      <w:r>
-        <w:rPr>
-          <w:noProof/>
-        </w:rPr>
-        <w:fldChar w:fldCharType="end"/>
-      </w:r>
+      <w:fldSimple w:instr=" SEQ Table \* ARABIC ">
+        <w:r>
+          <w:rPr>
+            <w:noProof/>
+          </w:rPr>
+          <w:t>2</w:t>
+        </w:r>
+      </w:fldSimple>
       <w:r>
         <w:t xml:space="preserve"> </w:t>
       </w:r>
@@ -5670,27 +5626,14 @@
       <w:r>
         <w:t xml:space="preserve">Table </w:t>
       </w:r>
-      <w:r>
-        <w:fldChar w:fldCharType="begin"/>
-      </w:r>
-      <w:r>
-        <w:instrText xml:space="preserve"> SEQ Table \* ARABIC </w:instrText>
-      </w:r>
-      <w:r>
-        <w:fldChar w:fldCharType="separate"/>
-      </w:r>
-      <w:r>
-        <w:rPr>
-          <w:noProof/>
-        </w:rPr>
-        <w:t>3</w:t>
-      </w:r>
-      <w:r>
-        <w:rPr>
-          <w:noProof/>
-        </w:rPr>
-        <w:fldChar w:fldCharType="end"/>
-      </w:r>
+      <w:fldSimple w:instr=" SEQ Table \* ARABIC ">
+        <w:r>
+          <w:rPr>
+            <w:noProof/>
+          </w:rPr>
+          <w:t>3</w:t>
+        </w:r>
+      </w:fldSimple>
       <w:r>
         <w:t xml:space="preserve"> Summary of responses in the fin fish fishery. </w:t>
       </w:r>
@@ -9767,32 +9710,19 @@
         <w:pStyle w:val="Caption"/>
         <w:jc w:val="both"/>
       </w:pPr>
-      <w:bookmarkStart w:id="3" w:name="_Ref181095124"/>
+      <w:bookmarkStart w:id="6" w:name="_Ref181095124"/>
       <w:r>
         <w:t xml:space="preserve">Figure </w:t>
       </w:r>
-      <w:r>
-        <w:fldChar w:fldCharType="begin"/>
-      </w:r>
-      <w:r>
-        <w:instrText xml:space="preserve"> SEQ Figure \* ARABIC </w:instrText>
-      </w:r>
-      <w:r>
-        <w:fldChar w:fldCharType="separate"/>
-      </w:r>
-      <w:r>
-        <w:rPr>
-          <w:noProof/>
-        </w:rPr>
-        <w:t>4</w:t>
-      </w:r>
-      <w:r>
-        <w:rPr>
-          <w:noProof/>
-        </w:rPr>
-        <w:fldChar w:fldCharType="end"/>
-      </w:r>
-      <w:bookmarkEnd w:id="3"/>
+      <w:fldSimple w:instr=" SEQ Figure \* ARABIC ">
+        <w:r>
+          <w:rPr>
+            <w:noProof/>
+          </w:rPr>
+          <w:t>4</w:t>
+        </w:r>
+      </w:fldSimple>
+      <w:bookmarkEnd w:id="6"/>
       <w:r>
         <w:t xml:space="preserve"> Purchase of seafood products from retailers in Caye Caulker</w:t>
       </w:r>
@@ -10012,27 +9942,14 @@
       <w:r>
         <w:t xml:space="preserve">Figure </w:t>
       </w:r>
-      <w:r>
-        <w:fldChar w:fldCharType="begin"/>
-      </w:r>
-      <w:r>
-        <w:instrText xml:space="preserve"> SEQ Figure \* ARABIC </w:instrText>
-      </w:r>
-      <w:r>
-        <w:fldChar w:fldCharType="separate"/>
-      </w:r>
-      <w:r>
-        <w:rPr>
-          <w:noProof/>
-        </w:rPr>
-        <w:t>5</w:t>
-      </w:r>
-      <w:r>
-        <w:rPr>
-          <w:noProof/>
-        </w:rPr>
-        <w:fldChar w:fldCharType="end"/>
-      </w:r>
+      <w:fldSimple w:instr=" SEQ Figure \* ARABIC ">
+        <w:r>
+          <w:rPr>
+            <w:noProof/>
+          </w:rPr>
+          <w:t>5</w:t>
+        </w:r>
+      </w:fldSimple>
       <w:r>
         <w:t xml:space="preserve"> </w:t>
       </w:r>
@@ -10157,27 +10074,14 @@
       <w:r>
         <w:t xml:space="preserve">Figure </w:t>
       </w:r>
-      <w:r>
-        <w:fldChar w:fldCharType="begin"/>
-      </w:r>
-      <w:r>
-        <w:instrText xml:space="preserve"> SEQ Figure \* ARABIC </w:instrText>
-      </w:r>
-      <w:r>
-        <w:fldChar w:fldCharType="separate"/>
-      </w:r>
-      <w:r>
-        <w:rPr>
-          <w:noProof/>
-        </w:rPr>
-        <w:t>6</w:t>
-      </w:r>
-      <w:r>
-        <w:rPr>
-          <w:noProof/>
-        </w:rPr>
-        <w:fldChar w:fldCharType="end"/>
-      </w:r>
+      <w:fldSimple w:instr=" SEQ Figure \* ARABIC ">
+        <w:r>
+          <w:rPr>
+            <w:noProof/>
+          </w:rPr>
+          <w:t>6</w:t>
+        </w:r>
+      </w:fldSimple>
       <w:r>
         <w:t xml:space="preserve"> Monthly total consumption per species.</w:t>
       </w:r>
@@ -10262,33 +10166,20 @@
         <w:keepNext/>
         <w:jc w:val="both"/>
       </w:pPr>
-      <w:bookmarkStart w:id="4" w:name="_Ref181339521"/>
+      <w:bookmarkStart w:id="7" w:name="_Ref181339521"/>
       <w:r>
         <w:lastRenderedPageBreak/>
         <w:t xml:space="preserve">Table </w:t>
       </w:r>
-      <w:r>
-        <w:fldChar w:fldCharType="begin"/>
-      </w:r>
-      <w:r>
-        <w:instrText xml:space="preserve"> SEQ Table \* ARABIC </w:instrText>
-      </w:r>
-      <w:r>
-        <w:fldChar w:fldCharType="separate"/>
-      </w:r>
-      <w:r>
-        <w:rPr>
-          <w:noProof/>
-        </w:rPr>
-        <w:t>4</w:t>
-      </w:r>
-      <w:r>
-        <w:rPr>
-          <w:noProof/>
-        </w:rPr>
-        <w:fldChar w:fldCharType="end"/>
-      </w:r>
-      <w:bookmarkEnd w:id="4"/>
+      <w:fldSimple w:instr=" SEQ Table \* ARABIC ">
+        <w:r>
+          <w:rPr>
+            <w:noProof/>
+          </w:rPr>
+          <w:t>4</w:t>
+        </w:r>
+      </w:fldSimple>
+      <w:bookmarkEnd w:id="7"/>
       <w:r>
         <w:t xml:space="preserve"> Consumption of sea food species in Caye Caulker. NA= do not report their participant ID. Values are in pounds consumed by month.</w:t>
       </w:r>
@@ -14367,32 +14258,19 @@
         <w:pStyle w:val="Caption"/>
         <w:jc w:val="both"/>
       </w:pPr>
-      <w:bookmarkStart w:id="5" w:name="_Ref181341098"/>
+      <w:bookmarkStart w:id="8" w:name="_Ref181341098"/>
       <w:r>
         <w:t xml:space="preserve">Figure </w:t>
       </w:r>
-      <w:r>
-        <w:fldChar w:fldCharType="begin"/>
-      </w:r>
-      <w:r>
-        <w:instrText xml:space="preserve"> SEQ Figure \* ARABIC </w:instrText>
-      </w:r>
-      <w:r>
-        <w:fldChar w:fldCharType="separate"/>
-      </w:r>
-      <w:r>
-        <w:rPr>
-          <w:noProof/>
-        </w:rPr>
-        <w:t>7</w:t>
-      </w:r>
-      <w:r>
-        <w:rPr>
-          <w:noProof/>
-        </w:rPr>
-        <w:fldChar w:fldCharType="end"/>
-      </w:r>
-      <w:bookmarkEnd w:id="5"/>
+      <w:fldSimple w:instr=" SEQ Figure \* ARABIC ">
+        <w:r>
+          <w:rPr>
+            <w:noProof/>
+          </w:rPr>
+          <w:t>7</w:t>
+        </w:r>
+      </w:fldSimple>
+      <w:bookmarkEnd w:id="8"/>
       <w:r>
         <w:t xml:space="preserve"> </w:t>
       </w:r>
@@ -14678,18 +14556,135 @@
         <w:pStyle w:val="Caption"/>
         <w:jc w:val="both"/>
       </w:pPr>
-      <w:bookmarkStart w:id="6" w:name="_Ref181434312"/>
+      <w:bookmarkStart w:id="9" w:name="_Ref181434312"/>
       <w:r>
         <w:t xml:space="preserve">Figure </w:t>
       </w:r>
+      <w:fldSimple w:instr=" SEQ Figure \* ARABIC ">
+        <w:r>
+          <w:rPr>
+            <w:noProof/>
+          </w:rPr>
+          <w:t>8</w:t>
+        </w:r>
+      </w:fldSimple>
+      <w:bookmarkEnd w:id="9"/>
+      <w:r>
+        <w:t xml:space="preserve"> </w:t>
+      </w:r>
+      <w:r>
+        <w:t xml:space="preserve">How </w:t>
+      </w:r>
+      <w:r>
+        <w:t>i</w:t>
+      </w:r>
+      <w:r>
+        <w:t xml:space="preserve">nstitutions </w:t>
+      </w:r>
+      <w:r>
+        <w:t>i</w:t>
+      </w:r>
+      <w:r>
+        <w:t xml:space="preserve">nteract with </w:t>
+      </w:r>
+      <w:r>
+        <w:t>f</w:t>
+      </w:r>
+      <w:r>
+        <w:t>ishers</w:t>
+      </w:r>
+    </w:p>
+    <w:p>
+      <w:pPr>
+        <w:jc w:val="both"/>
+      </w:pPr>
+      <w:r>
+        <w:t xml:space="preserve">Overall, the </w:t>
+      </w:r>
+      <w:r>
+        <w:t xml:space="preserve">previous </w:t>
+      </w:r>
+      <w:r>
+        <w:t xml:space="preserve">graph highlights the importance of training, education, and outreach in the interactions between institutions and fishers. It also suggests potential areas for improvement, such as increasing involvement in governance and decision-making processes and strengthening </w:t>
+      </w:r>
+      <w:r>
+        <w:t xml:space="preserve">capacity building, </w:t>
+      </w:r>
+      <w:r>
+        <w:t>monitoring and research efforts</w:t>
+      </w:r>
+      <w:r>
+        <w:t>.</w:t>
+      </w:r>
+    </w:p>
+    <w:p>
+      <w:pPr>
+        <w:jc w:val="both"/>
+      </w:pPr>
+      <w:r>
+        <w:t>When asked, “</w:t>
+      </w:r>
+      <w:r>
+        <w:t xml:space="preserve">How does your institution interact with wholesalers and retailers" </w:t>
+      </w:r>
+      <w:r>
+        <w:t>we obtained</w:t>
+      </w:r>
+      <w:r>
+        <w:t xml:space="preserve"> three respondents</w:t>
+      </w:r>
+      <w:r>
+        <w:t xml:space="preserve"> (</w:t>
+      </w:r>
       <w:r>
         <w:fldChar w:fldCharType="begin"/>
       </w:r>
       <w:r>
-        <w:instrText xml:space="preserve"> SEQ Figure \* ARABIC </w:instrText>
+        <w:instrText xml:space="preserve"> REF _Ref181435300 \h  \* MERGEFORMAT </w:instrText>
       </w:r>
       <w:r>
         <w:fldChar w:fldCharType="separate"/>
+      </w:r>
+      <w:r>
+        <w:t xml:space="preserve">Figure </w:t>
+      </w:r>
+      <w:r>
+        <w:rPr>
+          <w:noProof/>
+        </w:rPr>
+        <w:t>9</w:t>
+      </w:r>
+      <w:r>
+        <w:fldChar w:fldCharType="end"/>
+      </w:r>
+      <w:r>
+        <w:t>)</w:t>
+      </w:r>
+      <w:r>
+        <w:t xml:space="preserve">. </w:t>
+      </w:r>
+      <w:proofErr w:type="gramStart"/>
+      <w:r>
+        <w:t>Similar to</w:t>
+      </w:r>
+      <w:proofErr w:type="gramEnd"/>
+      <w:r>
+        <w:t xml:space="preserve"> the previous graph</w:t>
+      </w:r>
+      <w:r>
+        <w:t xml:space="preserve"> (</w:t>
+      </w:r>
+      <w:r>
+        <w:fldChar w:fldCharType="begin"/>
+      </w:r>
+      <w:r>
+        <w:instrText xml:space="preserve"> REF _Ref181434312 \h  \* MERGEFORMAT </w:instrText>
+      </w:r>
+      <w:r>
+        <w:fldChar w:fldCharType="separate"/>
+      </w:r>
+      <w:r>
+        <w:t xml:space="preserve">Figure </w:t>
       </w:r>
       <w:r>
         <w:rPr>
@@ -14698,75 +14693,25 @@
         <w:t>8</w:t>
       </w:r>
       <w:r>
-        <w:rPr>
-          <w:noProof/>
-        </w:rPr>
         <w:fldChar w:fldCharType="end"/>
       </w:r>
-      <w:bookmarkEnd w:id="6"/>
+      <w:r>
+        <w:t>)</w:t>
+      </w:r>
+      <w:r>
+        <w:t>, "Training programs" and "Education and outreach" received the highest scores, both at 2 (66.7%). This suggests that institutions prioritize knowledge sharing with wholesalers and retailers.</w:t>
+      </w:r>
       <w:r>
         <w:t xml:space="preserve"> </w:t>
       </w:r>
       <w:r>
-        <w:t xml:space="preserve">How </w:t>
-      </w:r>
-      <w:r>
-        <w:t>i</w:t>
-      </w:r>
-      <w:r>
-        <w:t xml:space="preserve">nstitutions </w:t>
-      </w:r>
-      <w:r>
-        <w:t>i</w:t>
-      </w:r>
-      <w:r>
-        <w:t xml:space="preserve">nteract with </w:t>
-      </w:r>
-      <w:r>
-        <w:t>f</w:t>
-      </w:r>
-      <w:r>
-        <w:t>ishers</w:t>
-      </w:r>
-    </w:p>
-    <w:p>
-      <w:pPr>
-        <w:jc w:val="both"/>
-      </w:pPr>
-      <w:r>
-        <w:t xml:space="preserve">Overall, the </w:t>
-      </w:r>
-      <w:r>
-        <w:t xml:space="preserve">previous </w:t>
-      </w:r>
-      <w:r>
-        <w:t xml:space="preserve">graph highlights the importance of training, education, and outreach in the interactions between institutions and fishers. It also suggests potential areas for improvement, such as increasing involvement in governance and decision-making processes and strengthening </w:t>
-      </w:r>
-      <w:r>
-        <w:t xml:space="preserve">capacity building, </w:t>
-      </w:r>
-      <w:r>
-        <w:t>monitoring and research efforts</w:t>
-      </w:r>
-      <w:r>
-        <w:t>.</w:t>
-      </w:r>
-    </w:p>
-    <w:p>
-      <w:pPr>
-        <w:jc w:val="both"/>
-      </w:pPr>
-      <w:r>
-        <w:t>When asked, “</w:t>
-      </w:r>
-      <w:r>
-        <w:t xml:space="preserve">How does your institution interact with wholesalers and retailers" </w:t>
-      </w:r>
-      <w:r>
-        <w:t>we obtained</w:t>
-      </w:r>
-      <w:r>
-        <w:t xml:space="preserve"> three respondents</w:t>
+        <w:t>Governance and decision making received a score of 1 (33.3%), indicating a moderate level of involvement in shaping policies and regulations.</w:t>
+      </w:r>
+      <w:r>
+        <w:t xml:space="preserve"> </w:t>
+      </w:r>
+      <w:r>
+        <w:t>The remaining categories, such as "Licensing," "Quota allocation," "Monitoring catch," "Research," "Other," and "Governance and decision making," received either 0 or 1 response, suggesting that these areas are not as prominent in the interactions between institutions and wholesalers/retailers</w:t>
       </w:r>
       <w:r>
         <w:t xml:space="preserve"> (</w:t>
@@ -14796,86 +14741,6 @@
         <w:t>)</w:t>
       </w:r>
       <w:r>
-        <w:t xml:space="preserve">. </w:t>
-      </w:r>
-      <w:proofErr w:type="gramStart"/>
-      <w:r>
-        <w:t>Similar to</w:t>
-      </w:r>
-      <w:proofErr w:type="gramEnd"/>
-      <w:r>
-        <w:t xml:space="preserve"> the previous graph</w:t>
-      </w:r>
-      <w:r>
-        <w:t xml:space="preserve"> (</w:t>
-      </w:r>
-      <w:r>
-        <w:fldChar w:fldCharType="begin"/>
-      </w:r>
-      <w:r>
-        <w:instrText xml:space="preserve"> REF _Ref181434312 \h  \* MERGEFORMAT </w:instrText>
-      </w:r>
-      <w:r>
-        <w:fldChar w:fldCharType="separate"/>
-      </w:r>
-      <w:r>
-        <w:t xml:space="preserve">Figure </w:t>
-      </w:r>
-      <w:r>
-        <w:rPr>
-          <w:noProof/>
-        </w:rPr>
-        <w:t>8</w:t>
-      </w:r>
-      <w:r>
-        <w:fldChar w:fldCharType="end"/>
-      </w:r>
-      <w:r>
-        <w:t>)</w:t>
-      </w:r>
-      <w:r>
-        <w:t>, "Training programs" and "Education and outreach" received the highest scores, both at 2 (66.7%). This suggests that institutions prioritize knowledge sharing with wholesalers and retailers.</w:t>
-      </w:r>
-      <w:r>
-        <w:t xml:space="preserve"> </w:t>
-      </w:r>
-      <w:r>
-        <w:t>Governance and decision making received a score of 1 (33.3%), indicating a moderate level of involvement in shaping policies and regulations.</w:t>
-      </w:r>
-      <w:r>
-        <w:t xml:space="preserve"> </w:t>
-      </w:r>
-      <w:r>
-        <w:t>The remaining categories, such as "Licensing," "Quota allocation," "Monitoring catch," "Research," "Other," and "Governance and decision making," received either 0 or 1 response, suggesting that these areas are not as prominent in the interactions between institutions and wholesalers/retailers</w:t>
-      </w:r>
-      <w:r>
-        <w:t xml:space="preserve"> (</w:t>
-      </w:r>
-      <w:r>
-        <w:fldChar w:fldCharType="begin"/>
-      </w:r>
-      <w:r>
-        <w:instrText xml:space="preserve"> REF _Ref181435300 \h  \* MERGEFORMAT </w:instrText>
-      </w:r>
-      <w:r>
-        <w:fldChar w:fldCharType="separate"/>
-      </w:r>
-      <w:r>
-        <w:t xml:space="preserve">Figure </w:t>
-      </w:r>
-      <w:r>
-        <w:rPr>
-          <w:noProof/>
-        </w:rPr>
-        <w:t>9</w:t>
-      </w:r>
-      <w:r>
-        <w:fldChar w:fldCharType="end"/>
-      </w:r>
-      <w:r>
-        <w:t>)</w:t>
-      </w:r>
-      <w:r>
         <w:t>.</w:t>
       </w:r>
     </w:p>
@@ -14889,7 +14754,7 @@
           <w:noProof/>
         </w:rPr>
         <w:drawing>
-          <wp:inline distT="0" distB="0" distL="0" distR="0" wp14:anchorId="41AF90DD" wp14:editId="025D0DD0">
+          <wp:inline distT="0" distB="0" distL="0" distR="0" wp14:anchorId="41AF90DD" wp14:editId="10AB48CA">
             <wp:extent cx="5188120" cy="2462694"/>
             <wp:effectExtent l="0" t="0" r="0" b="0"/>
             <wp:docPr id="874740129" name="Picture 3" descr="Forms response chart. Question title: How does your institution interact with wholesalers and retailers. Number of responses: 3 responses."/>
@@ -14943,32 +14808,19 @@
         <w:pStyle w:val="Caption"/>
         <w:jc w:val="both"/>
       </w:pPr>
-      <w:bookmarkStart w:id="7" w:name="_Ref181435300"/>
+      <w:bookmarkStart w:id="10" w:name="_Ref181435300"/>
       <w:r>
         <w:t xml:space="preserve">Figure </w:t>
       </w:r>
-      <w:r>
-        <w:fldChar w:fldCharType="begin"/>
-      </w:r>
-      <w:r>
-        <w:instrText xml:space="preserve"> SEQ Figure \* ARABIC </w:instrText>
-      </w:r>
-      <w:r>
-        <w:fldChar w:fldCharType="separate"/>
-      </w:r>
-      <w:r>
-        <w:rPr>
-          <w:noProof/>
-        </w:rPr>
-        <w:t>9</w:t>
-      </w:r>
-      <w:r>
-        <w:rPr>
-          <w:noProof/>
-        </w:rPr>
-        <w:fldChar w:fldCharType="end"/>
-      </w:r>
-      <w:bookmarkEnd w:id="7"/>
+      <w:fldSimple w:instr=" SEQ Figure \* ARABIC ">
+        <w:r>
+          <w:rPr>
+            <w:noProof/>
+          </w:rPr>
+          <w:t>9</w:t>
+        </w:r>
+      </w:fldSimple>
+      <w:bookmarkEnd w:id="10"/>
       <w:r>
         <w:t xml:space="preserve"> </w:t>
       </w:r>
@@ -15157,32 +15009,19 @@
         <w:pStyle w:val="Caption"/>
         <w:jc w:val="both"/>
       </w:pPr>
-      <w:bookmarkStart w:id="8" w:name="_Ref181435485"/>
+      <w:bookmarkStart w:id="11" w:name="_Ref181435485"/>
       <w:r>
         <w:t xml:space="preserve">Figure </w:t>
       </w:r>
-      <w:r>
-        <w:fldChar w:fldCharType="begin"/>
-      </w:r>
-      <w:r>
-        <w:instrText xml:space="preserve"> SEQ Figure \* ARABIC </w:instrText>
-      </w:r>
-      <w:r>
-        <w:fldChar w:fldCharType="separate"/>
-      </w:r>
-      <w:r>
-        <w:rPr>
-          <w:noProof/>
-        </w:rPr>
-        <w:t>10</w:t>
-      </w:r>
-      <w:r>
-        <w:rPr>
-          <w:noProof/>
-        </w:rPr>
-        <w:fldChar w:fldCharType="end"/>
-      </w:r>
-      <w:bookmarkEnd w:id="8"/>
+      <w:fldSimple w:instr=" SEQ Figure \* ARABIC ">
+        <w:r>
+          <w:rPr>
+            <w:noProof/>
+          </w:rPr>
+          <w:t>10</w:t>
+        </w:r>
+      </w:fldSimple>
+      <w:bookmarkEnd w:id="11"/>
       <w:r>
         <w:t xml:space="preserve"> Point</w:t>
       </w:r>
@@ -15268,27 +15107,14 @@
       <w:r>
         <w:t xml:space="preserve">Table </w:t>
       </w:r>
-      <w:r>
-        <w:fldChar w:fldCharType="begin"/>
-      </w:r>
-      <w:r>
-        <w:instrText xml:space="preserve"> SEQ Table \* ARABIC </w:instrText>
-      </w:r>
-      <w:r>
-        <w:fldChar w:fldCharType="separate"/>
-      </w:r>
-      <w:r>
-        <w:rPr>
-          <w:noProof/>
-        </w:rPr>
-        <w:t>5</w:t>
-      </w:r>
-      <w:r>
-        <w:rPr>
-          <w:noProof/>
-        </w:rPr>
-        <w:fldChar w:fldCharType="end"/>
-      </w:r>
+      <w:fldSimple w:instr=" SEQ Table \* ARABIC ">
+        <w:r>
+          <w:rPr>
+            <w:noProof/>
+          </w:rPr>
+          <w:t>5</w:t>
+        </w:r>
+      </w:fldSimple>
       <w:r>
         <w:t xml:space="preserve"> S</w:t>
       </w:r>
@@ -17023,32 +16849,19 @@
         <w:keepNext/>
         <w:jc w:val="both"/>
       </w:pPr>
-      <w:bookmarkStart w:id="9" w:name="_Ref181179167"/>
+      <w:bookmarkStart w:id="12" w:name="_Ref181179167"/>
       <w:r>
         <w:t xml:space="preserve">Table </w:t>
       </w:r>
-      <w:r>
-        <w:fldChar w:fldCharType="begin"/>
-      </w:r>
-      <w:r>
-        <w:instrText xml:space="preserve"> SEQ Table \* ARABIC </w:instrText>
-      </w:r>
-      <w:r>
-        <w:fldChar w:fldCharType="separate"/>
-      </w:r>
-      <w:r>
-        <w:rPr>
-          <w:noProof/>
-        </w:rPr>
-        <w:t>6</w:t>
-      </w:r>
-      <w:r>
-        <w:rPr>
-          <w:noProof/>
-        </w:rPr>
-        <w:fldChar w:fldCharType="end"/>
-      </w:r>
-      <w:bookmarkEnd w:id="9"/>
+      <w:fldSimple w:instr=" SEQ Table \* ARABIC ">
+        <w:r>
+          <w:rPr>
+            <w:noProof/>
+          </w:rPr>
+          <w:t>6</w:t>
+        </w:r>
+      </w:fldSimple>
+      <w:bookmarkEnd w:id="12"/>
       <w:r>
         <w:t xml:space="preserve"> Summary of responses in the lobster fishery</w:t>
       </w:r>
@@ -19354,32 +19167,19 @@
         <w:keepNext/>
         <w:jc w:val="both"/>
       </w:pPr>
-      <w:bookmarkStart w:id="10" w:name="_Ref181191601"/>
+      <w:bookmarkStart w:id="13" w:name="_Ref181191601"/>
       <w:r>
         <w:t xml:space="preserve">Table </w:t>
       </w:r>
-      <w:r>
-        <w:fldChar w:fldCharType="begin"/>
-      </w:r>
-      <w:r>
-        <w:instrText xml:space="preserve"> SEQ Table \* ARABIC </w:instrText>
-      </w:r>
-      <w:r>
-        <w:fldChar w:fldCharType="separate"/>
-      </w:r>
-      <w:r>
-        <w:rPr>
-          <w:noProof/>
-        </w:rPr>
-        <w:t>7</w:t>
-      </w:r>
-      <w:r>
-        <w:rPr>
-          <w:noProof/>
-        </w:rPr>
-        <w:fldChar w:fldCharType="end"/>
-      </w:r>
-      <w:bookmarkEnd w:id="10"/>
+      <w:fldSimple w:instr=" SEQ Table \* ARABIC ">
+        <w:r>
+          <w:rPr>
+            <w:noProof/>
+          </w:rPr>
+          <w:t>7</w:t>
+        </w:r>
+      </w:fldSimple>
+      <w:bookmarkEnd w:id="13"/>
       <w:r>
         <w:t xml:space="preserve"> </w:t>
       </w:r>
@@ -21800,7 +21600,7 @@
       <w:pPr>
         <w:jc w:val="both"/>
       </w:pPr>
-      <w:bookmarkStart w:id="11" w:name="_Ref181197321"/>
+      <w:bookmarkStart w:id="14" w:name="_Ref181197321"/>
       <w:r>
         <w:lastRenderedPageBreak/>
         <w:t>Fish are primarily sold to local restaurants, vendors, or even resorts. The female fisher reported that she does not sell her catch. Two of the fishermen reported belonging to the Placencia Cooperative</w:t>
@@ -21850,33 +21650,20 @@
         <w:keepNext/>
         <w:jc w:val="both"/>
       </w:pPr>
-      <w:bookmarkStart w:id="12" w:name="_Ref185539908"/>
+      <w:bookmarkStart w:id="15" w:name="_Ref185539908"/>
       <w:r>
         <w:t xml:space="preserve">Table </w:t>
       </w:r>
-      <w:r>
-        <w:fldChar w:fldCharType="begin"/>
-      </w:r>
-      <w:r>
-        <w:instrText xml:space="preserve"> SEQ Table \* ARABIC </w:instrText>
-      </w:r>
-      <w:r>
-        <w:fldChar w:fldCharType="separate"/>
-      </w:r>
-      <w:r>
-        <w:rPr>
-          <w:noProof/>
-        </w:rPr>
-        <w:t>8</w:t>
-      </w:r>
-      <w:r>
-        <w:rPr>
-          <w:noProof/>
-        </w:rPr>
-        <w:fldChar w:fldCharType="end"/>
-      </w:r>
-      <w:bookmarkEnd w:id="11"/>
-      <w:bookmarkEnd w:id="12"/>
+      <w:fldSimple w:instr=" SEQ Table \* ARABIC ">
+        <w:r>
+          <w:rPr>
+            <w:noProof/>
+          </w:rPr>
+          <w:t>8</w:t>
+        </w:r>
+      </w:fldSimple>
+      <w:bookmarkEnd w:id="14"/>
+      <w:bookmarkEnd w:id="15"/>
       <w:r>
         <w:t xml:space="preserve"> Summary of responses in the fin fish fishery. </w:t>
       </w:r>
@@ -25665,32 +25452,19 @@
         <w:keepNext/>
         <w:jc w:val="both"/>
       </w:pPr>
-      <w:bookmarkStart w:id="13" w:name="_Ref185539956"/>
+      <w:bookmarkStart w:id="16" w:name="_Ref185539956"/>
       <w:r>
         <w:t xml:space="preserve">Table </w:t>
       </w:r>
-      <w:r>
-        <w:fldChar w:fldCharType="begin"/>
-      </w:r>
-      <w:r>
-        <w:instrText xml:space="preserve"> SEQ Table \* ARABIC </w:instrText>
-      </w:r>
-      <w:r>
-        <w:fldChar w:fldCharType="separate"/>
-      </w:r>
-      <w:r>
-        <w:rPr>
-          <w:noProof/>
-        </w:rPr>
-        <w:t>9</w:t>
-      </w:r>
-      <w:r>
-        <w:rPr>
-          <w:noProof/>
-        </w:rPr>
-        <w:fldChar w:fldCharType="end"/>
-      </w:r>
-      <w:bookmarkEnd w:id="13"/>
+      <w:fldSimple w:instr=" SEQ Table \* ARABIC ">
+        <w:r>
+          <w:rPr>
+            <w:noProof/>
+          </w:rPr>
+          <w:t>9</w:t>
+        </w:r>
+      </w:fldSimple>
+      <w:bookmarkEnd w:id="16"/>
       <w:r>
         <w:t xml:space="preserve"> Quantities and values associated with the fishery species in Placencia. Quantities </w:t>
       </w:r>
@@ -27277,32 +27051,19 @@
         <w:pStyle w:val="Caption"/>
         <w:jc w:val="both"/>
       </w:pPr>
-      <w:bookmarkStart w:id="14" w:name="_Ref181341252"/>
+      <w:bookmarkStart w:id="17" w:name="_Ref181341252"/>
       <w:r>
         <w:t xml:space="preserve">Figure </w:t>
       </w:r>
-      <w:r>
-        <w:fldChar w:fldCharType="begin"/>
-      </w:r>
-      <w:r>
-        <w:instrText xml:space="preserve"> SEQ Figure \* ARABIC </w:instrText>
-      </w:r>
-      <w:r>
-        <w:fldChar w:fldCharType="separate"/>
-      </w:r>
-      <w:r>
-        <w:rPr>
-          <w:noProof/>
-        </w:rPr>
-        <w:t>11</w:t>
-      </w:r>
-      <w:r>
-        <w:rPr>
-          <w:noProof/>
-        </w:rPr>
-        <w:fldChar w:fldCharType="end"/>
-      </w:r>
-      <w:bookmarkEnd w:id="14"/>
+      <w:fldSimple w:instr=" SEQ Figure \* ARABIC ">
+        <w:r>
+          <w:rPr>
+            <w:noProof/>
+          </w:rPr>
+          <w:t>11</w:t>
+        </w:r>
+      </w:fldSimple>
+      <w:bookmarkEnd w:id="17"/>
       <w:r>
         <w:t xml:space="preserve"> </w:t>
       </w:r>
@@ -27446,32 +27207,19 @@
         <w:pStyle w:val="Caption"/>
         <w:jc w:val="both"/>
       </w:pPr>
-      <w:bookmarkStart w:id="15" w:name="_Ref181338722"/>
+      <w:bookmarkStart w:id="18" w:name="_Ref181338722"/>
       <w:r>
         <w:t xml:space="preserve">Figure </w:t>
       </w:r>
-      <w:r>
-        <w:fldChar w:fldCharType="begin"/>
-      </w:r>
-      <w:r>
-        <w:instrText xml:space="preserve"> SEQ Figure \* ARABIC </w:instrText>
-      </w:r>
-      <w:r>
-        <w:fldChar w:fldCharType="separate"/>
-      </w:r>
-      <w:r>
-        <w:rPr>
-          <w:noProof/>
-        </w:rPr>
-        <w:t>12</w:t>
-      </w:r>
-      <w:r>
-        <w:rPr>
-          <w:noProof/>
-        </w:rPr>
-        <w:fldChar w:fldCharType="end"/>
-      </w:r>
-      <w:bookmarkEnd w:id="15"/>
+      <w:fldSimple w:instr=" SEQ Figure \* ARABIC ">
+        <w:r>
+          <w:rPr>
+            <w:noProof/>
+          </w:rPr>
+          <w:t>12</w:t>
+        </w:r>
+      </w:fldSimple>
+      <w:bookmarkEnd w:id="18"/>
       <w:r>
         <w:t xml:space="preserve"> Monthly average per capita consumption in Placencia.</w:t>
       </w:r>
@@ -27563,32 +27311,19 @@
         <w:keepNext/>
         <w:jc w:val="both"/>
       </w:pPr>
-      <w:bookmarkStart w:id="16" w:name="_Ref185516966"/>
+      <w:bookmarkStart w:id="19" w:name="_Ref185516966"/>
       <w:r>
         <w:t xml:space="preserve">Table </w:t>
       </w:r>
-      <w:r>
-        <w:fldChar w:fldCharType="begin"/>
-      </w:r>
-      <w:r>
-        <w:instrText xml:space="preserve"> SEQ Table \* ARABIC </w:instrText>
-      </w:r>
-      <w:r>
-        <w:fldChar w:fldCharType="separate"/>
-      </w:r>
-      <w:r>
-        <w:rPr>
-          <w:noProof/>
-        </w:rPr>
-        <w:t>10</w:t>
-      </w:r>
-      <w:r>
-        <w:rPr>
-          <w:noProof/>
-        </w:rPr>
-        <w:fldChar w:fldCharType="end"/>
-      </w:r>
-      <w:bookmarkEnd w:id="16"/>
+      <w:fldSimple w:instr=" SEQ Table \* ARABIC ">
+        <w:r>
+          <w:rPr>
+            <w:noProof/>
+          </w:rPr>
+          <w:t>10</w:t>
+        </w:r>
+      </w:fldSimple>
+      <w:bookmarkEnd w:id="19"/>
       <w:r>
         <w:t xml:space="preserve"> </w:t>
       </w:r>
@@ -29286,32 +29021,19 @@
         <w:pStyle w:val="Caption"/>
         <w:jc w:val="both"/>
       </w:pPr>
-      <w:bookmarkStart w:id="17" w:name="_Ref185515499"/>
+      <w:bookmarkStart w:id="20" w:name="_Ref185515499"/>
       <w:r>
         <w:t xml:space="preserve">Figure </w:t>
       </w:r>
-      <w:r>
-        <w:fldChar w:fldCharType="begin"/>
-      </w:r>
-      <w:r>
-        <w:instrText xml:space="preserve"> SEQ Figure \* ARABIC </w:instrText>
-      </w:r>
-      <w:r>
-        <w:fldChar w:fldCharType="separate"/>
-      </w:r>
-      <w:r>
-        <w:rPr>
-          <w:noProof/>
-        </w:rPr>
-        <w:t>13</w:t>
-      </w:r>
-      <w:r>
-        <w:rPr>
-          <w:noProof/>
-        </w:rPr>
-        <w:fldChar w:fldCharType="end"/>
-      </w:r>
-      <w:bookmarkEnd w:id="17"/>
+      <w:fldSimple w:instr=" SEQ Figure \* ARABIC ">
+        <w:r>
+          <w:rPr>
+            <w:noProof/>
+          </w:rPr>
+          <w:t>13</w:t>
+        </w:r>
+      </w:fldSimple>
+      <w:bookmarkEnd w:id="20"/>
       <w:r>
         <w:t xml:space="preserve"> </w:t>
       </w:r>
@@ -29457,32 +29179,19 @@
         <w:keepNext/>
         <w:jc w:val="both"/>
       </w:pPr>
-      <w:bookmarkStart w:id="18" w:name="_Ref181436886"/>
+      <w:bookmarkStart w:id="21" w:name="_Ref181436886"/>
       <w:r>
         <w:t xml:space="preserve">Table </w:t>
       </w:r>
-      <w:r>
-        <w:fldChar w:fldCharType="begin"/>
-      </w:r>
-      <w:r>
-        <w:instrText xml:space="preserve"> SEQ Table \* ARABIC </w:instrText>
-      </w:r>
-      <w:r>
-        <w:fldChar w:fldCharType="separate"/>
-      </w:r>
-      <w:r>
-        <w:rPr>
-          <w:noProof/>
-        </w:rPr>
-        <w:t>11</w:t>
-      </w:r>
-      <w:r>
-        <w:rPr>
-          <w:noProof/>
-        </w:rPr>
-        <w:fldChar w:fldCharType="end"/>
-      </w:r>
-      <w:bookmarkEnd w:id="18"/>
+      <w:fldSimple w:instr=" SEQ Table \* ARABIC ">
+        <w:r>
+          <w:rPr>
+            <w:noProof/>
+          </w:rPr>
+          <w:t>11</w:t>
+        </w:r>
+      </w:fldSimple>
+      <w:bookmarkEnd w:id="21"/>
       <w:r>
         <w:t xml:space="preserve"> S</w:t>
       </w:r>
@@ -32002,11 +31711,181 @@
     </w:p>
     <w:p>
       <w:pPr>
-        <w:jc w:val="both"/>
+        <w:pStyle w:val="Heading1"/>
       </w:pPr>
       <w:r>
         <w:lastRenderedPageBreak/>
         <w:t>Value chain analysis</w:t>
+      </w:r>
+    </w:p>
+    <w:p>
+      <w:pPr>
+        <w:pStyle w:val="Heading3"/>
+      </w:pPr>
+      <w:r>
+        <w:t>Percentage Contribution to GDP</w:t>
+      </w:r>
+    </w:p>
+    <w:p>
+      <w:pPr>
+        <w:jc w:val="both"/>
+      </w:pPr>
+      <w:r>
+        <w:t xml:space="preserve">This measures how much a specific sector contributes to the total </w:t>
+      </w:r>
+      <w:r>
+        <w:rPr>
+          <w:b/>
+          <w:bCs/>
+        </w:rPr>
+        <w:t>Gross Domestic Product (GDP)</w:t>
+      </w:r>
+      <w:r>
+        <w:t xml:space="preserve"> of a country. It is calculated as:</w:t>
+      </w:r>
+    </w:p>
+    <w:p>
+      <w:pPr>
+        <w:jc w:val="both"/>
+      </w:pPr>
+      <w:r>
+        <w:t>Sector Contribution to GDP (%)</w:t>
+      </w:r>
+      <w:r>
+        <w:t xml:space="preserve"> </w:t>
+      </w:r>
+      <w:r>
+        <w:t>=</w:t>
+      </w:r>
+      <w:r>
+        <w:t xml:space="preserve"> </w:t>
+      </w:r>
+      <w:r>
+        <w:t>(Sector GDP</w:t>
+      </w:r>
+      <w:r>
+        <w:t>/</w:t>
+      </w:r>
+      <w:r>
+        <w:t>National GDP</w:t>
+      </w:r>
+      <w:r>
+        <w:rPr>
+          <w:rFonts w:ascii="Arial" w:hAnsi="Arial" w:cs="Arial"/>
+        </w:rPr>
+        <w:t>​</w:t>
+      </w:r>
+      <w:r>
+        <w:t>)</w:t>
+      </w:r>
+      <w:r>
+        <w:t xml:space="preserve"> </w:t>
+      </w:r>
+      <w:r>
+        <w:t>×</w:t>
+      </w:r>
+      <w:r>
+        <w:t xml:space="preserve"> </w:t>
+      </w:r>
+      <w:r>
+        <w:t>100</w:t>
+      </w:r>
+    </w:p>
+    <w:p>
+      <w:pPr>
+        <w:jc w:val="both"/>
+      </w:pPr>
+      <w:r>
+        <w:t>For example, if the fishery sector contributes 1% of Belize’s national GDP, it means the total economic output of the fishery sector accounts for 1% of the country’s overall GDP.</w:t>
+      </w:r>
+    </w:p>
+    <w:p>
+      <w:pPr>
+        <w:pStyle w:val="Heading3"/>
+      </w:pPr>
+      <w:r>
+        <w:t>Value-Added Ratio</w:t>
+      </w:r>
+    </w:p>
+    <w:p>
+      <w:pPr>
+        <w:jc w:val="both"/>
+      </w:pPr>
+      <w:r>
+        <w:t xml:space="preserve">The value-added ratio focuses on how much value is created within the sector itself. It is the proportion of the sector's </w:t>
+      </w:r>
+      <w:r>
+        <w:rPr>
+          <w:b/>
+          <w:bCs/>
+        </w:rPr>
+        <w:t>value-added</w:t>
+      </w:r>
+      <w:r>
+        <w:t xml:space="preserve"> (output minus intermediate inputs) to its total output (or gross revenue). The formula is:</w:t>
+      </w:r>
+    </w:p>
+    <w:p>
+      <w:pPr>
+        <w:jc w:val="both"/>
+      </w:pPr>
+      <w:r>
+        <w:t>Value-Added Ratio= Value Added in the Sector</w:t>
+      </w:r>
+      <w:r>
+        <w:rPr>
+          <w:rFonts w:ascii="Arial" w:hAnsi="Arial" w:cs="Arial"/>
+        </w:rPr>
+        <w:t>​</w:t>
+      </w:r>
+      <w:r>
+        <w:rPr>
+          <w:rFonts w:ascii="Arial" w:hAnsi="Arial" w:cs="Arial"/>
+        </w:rPr>
+        <w:t xml:space="preserve"> / </w:t>
+      </w:r>
+      <w:r>
+        <w:t>Total Output of the Sector</w:t>
+      </w:r>
+    </w:p>
+    <w:p>
+      <w:pPr>
+        <w:numPr>
+          <w:ilvl w:val="0"/>
+          <w:numId w:val="19"/>
+        </w:numPr>
+        <w:jc w:val="both"/>
+      </w:pPr>
+      <w:proofErr w:type="gramStart"/>
+      <w:r>
+        <w:rPr>
+          <w:b/>
+          <w:bCs/>
+        </w:rPr>
+        <w:t>Value</w:t>
+      </w:r>
+      <w:proofErr w:type="gramEnd"/>
+      <w:r>
+        <w:rPr>
+          <w:b/>
+          <w:bCs/>
+        </w:rPr>
+        <w:t xml:space="preserve"> added</w:t>
+      </w:r>
+      <w:r>
+        <w:t xml:space="preserve"> represents the net contribution of the sector after subtracting costs of intermediate goods and services (inputs).</w:t>
+      </w:r>
+    </w:p>
+    <w:p>
+      <w:pPr>
+        <w:numPr>
+          <w:ilvl w:val="0"/>
+          <w:numId w:val="19"/>
+        </w:numPr>
+        <w:jc w:val="both"/>
+      </w:pPr>
+      <w:r>
+        <w:t>A higher value-added ratio indicates that the sector relies less on external inputs and creates more value internally (e.g., through labor, capital, or innovation).</w:t>
       </w:r>
     </w:p>
     <w:p>
@@ -32022,7 +31901,7 @@
           <w:b/>
           <w:bCs/>
         </w:rPr>
-        <w:t>1. Percentage Contribution to GDP</w:t>
+        <w:t>Relationship Between the Two</w:t>
       </w:r>
     </w:p>
     <w:p>
@@ -32030,67 +31909,152 @@
         <w:jc w:val="both"/>
       </w:pPr>
       <w:r>
-        <w:t xml:space="preserve">This measures how much a specific sector contributes to the total </w:t>
+        <w:t xml:space="preserve">The </w:t>
       </w:r>
       <w:r>
         <w:rPr>
           <w:b/>
           <w:bCs/>
         </w:rPr>
-        <w:t>Gross Domestic Product (GDP)</w:t>
-      </w:r>
-      <w:r>
-        <w:t xml:space="preserve"> of a country. It is calculated as:</w:t>
+        <w:t>percentage contribution to GDP</w:t>
+      </w:r>
+      <w:r>
+        <w:t xml:space="preserve"> is related to the sector's </w:t>
+      </w:r>
+      <w:r>
+        <w:rPr>
+          <w:b/>
+          <w:bCs/>
+        </w:rPr>
+        <w:t>value-added</w:t>
+      </w:r>
+      <w:r>
+        <w:t>, but they are not directly interchangeable:</w:t>
       </w:r>
     </w:p>
     <w:p>
       <w:pPr>
+        <w:numPr>
+          <w:ilvl w:val="0"/>
+          <w:numId w:val="20"/>
+        </w:numPr>
         <w:jc w:val="both"/>
       </w:pPr>
       <w:r>
-        <w:t>Sector Contribution to GDP (</w:t>
-      </w:r>
-      <w:proofErr w:type="gramStart"/>
-      <w:r>
-        <w:t>%)=</w:t>
-      </w:r>
-      <w:proofErr w:type="gramEnd"/>
-      <w:r>
-        <w:t>(Sector GDPNational GDP)×100\text{Sector Contribution to GDP (\%)} = \left( \frac{\text{Sector GDP}}{\text{National GDP}} \right) \times 100Sector Contribution to GDP (%)=(National </w:t>
-      </w:r>
-      <w:proofErr w:type="spellStart"/>
-      <w:r>
-        <w:t>GDPSector</w:t>
-      </w:r>
-      <w:proofErr w:type="spellEnd"/>
-      <w:r>
-        <w:t> GDP</w:t>
-      </w:r>
-      <w:r>
         <w:rPr>
-          <w:rFonts w:ascii="Arial" w:hAnsi="Arial" w:cs="Arial"/>
+          <w:b/>
+          <w:bCs/>
         </w:rPr>
-        <w:t>​</w:t>
-      </w:r>
-      <w:r>
-        <w:t>)×100</w:t>
+        <w:t>National GDP is based on value-added across all sectors.</w:t>
       </w:r>
     </w:p>
     <w:p>
       <w:pPr>
+        <w:numPr>
+          <w:ilvl w:val="1"/>
+          <w:numId w:val="20"/>
+        </w:numPr>
         <w:jc w:val="both"/>
       </w:pPr>
       <w:r>
-        <w:t>For example, if the fishery sector contributes 1% of Belize’s national GDP, it means the total economic output of the fishery sector accounts for 1% of the country’s overall GDP.</w:t>
+        <w:t xml:space="preserve">Each sector’s contribution to GDP reflects its total </w:t>
+      </w:r>
+      <w:r>
+        <w:rPr>
+          <w:b/>
+          <w:bCs/>
+        </w:rPr>
+        <w:t>value-added</w:t>
+      </w:r>
+      <w:r>
+        <w:t xml:space="preserve"> compared to other sectors in the economy.</w:t>
       </w:r>
     </w:p>
     <w:p>
       <w:pPr>
+        <w:numPr>
+          <w:ilvl w:val="1"/>
+          <w:numId w:val="20"/>
+        </w:numPr>
         <w:jc w:val="both"/>
       </w:pPr>
       <w:r>
-        <w:pict w14:anchorId="2D280788">
-          <v:rect id="_x0000_i1067" style="width:0;height:1.5pt" o:hralign="center" o:hrstd="t" o:hr="t" fillcolor="#a0a0a0" stroked="f"/>
+        <w:t>For instance, a sector with high value-added but low total output may still contribute a small percentage to the GDP if other sectors are significantly larger.</w:t>
+      </w:r>
+    </w:p>
+    <w:p>
+      <w:pPr>
+        <w:numPr>
+          <w:ilvl w:val="0"/>
+          <w:numId w:val="20"/>
+        </w:numPr>
+        <w:jc w:val="both"/>
+      </w:pPr>
+      <w:r>
+        <w:rPr>
+          <w:b/>
+          <w:bCs/>
+        </w:rPr>
+        <w:t xml:space="preserve">Value-Added Ratio is an </w:t>
+      </w:r>
+      <w:proofErr w:type="gramStart"/>
+      <w:r>
+        <w:rPr>
+          <w:b/>
+          <w:bCs/>
+        </w:rPr>
+        <w:t>efficiency</w:t>
+      </w:r>
+      <w:proofErr w:type="gramEnd"/>
+      <w:r>
+        <w:rPr>
+          <w:b/>
+          <w:bCs/>
+        </w:rPr>
+        <w:t xml:space="preserve"> metric within the sector.</w:t>
+      </w:r>
+    </w:p>
+    <w:p>
+      <w:pPr>
+        <w:numPr>
+          <w:ilvl w:val="1"/>
+          <w:numId w:val="20"/>
+        </w:numPr>
+        <w:jc w:val="both"/>
+      </w:pPr>
+      <w:r>
+        <w:t>It measures how efficiently a sector generates value from its total output.</w:t>
+      </w:r>
+    </w:p>
+    <w:p>
+      <w:pPr>
+        <w:numPr>
+          <w:ilvl w:val="1"/>
+          <w:numId w:val="20"/>
+        </w:numPr>
+        <w:jc w:val="both"/>
+      </w:pPr>
+      <w:r>
+        <w:t xml:space="preserve">Even if the fishery sector in Belize contributes 1% to the national GDP, its </w:t>
+      </w:r>
+      <w:r>
+        <w:rPr>
+          <w:b/>
+          <w:bCs/>
+        </w:rPr>
+        <w:t>value-added ratio</w:t>
+      </w:r>
+      <w:r>
+        <w:t xml:space="preserve"> depends on how much value it creates relative to its inputs and total production.</w:t>
+      </w:r>
+    </w:p>
+    <w:p>
+      <w:pPr>
+        <w:jc w:val="both"/>
+      </w:pPr>
+      <w:r>
+        <w:pict w14:anchorId="1CFF4D88">
+          <v:rect id="_x0000_i1025" style="width:0;height:1.5pt" o:hralign="center" o:hrstd="t" o:hr="t" fillcolor="#a0a0a0" stroked="f"/>
         </w:pict>
       </w:r>
     </w:p>
@@ -32107,41 +32071,99 @@
           <w:b/>
           <w:bCs/>
         </w:rPr>
-        <w:t>2. Value-Added Ratio</w:t>
+        <w:t>Example</w:t>
       </w:r>
     </w:p>
     <w:p>
       <w:pPr>
+        <w:numPr>
+          <w:ilvl w:val="0"/>
+          <w:numId w:val="21"/>
+        </w:numPr>
         <w:jc w:val="both"/>
       </w:pPr>
-      <w:r>
-        <w:t xml:space="preserve">The value-added ratio focuses on how much value is created within the sector itself. It is the proportion of the sector's </w:t>
-      </w:r>
       <w:r>
         <w:rPr>
           <w:b/>
           <w:bCs/>
         </w:rPr>
-        <w:t>value-added</w:t>
-      </w:r>
-      <w:r>
-        <w:t xml:space="preserve"> (output minus intermediate inputs) to its total output (or gross revenue). The formula is:</w:t>
+        <w:t>Fishery Sector Contribution to GDP:</w:t>
+      </w:r>
+      <w:r>
+        <w:t xml:space="preserve"> 1%</w:t>
       </w:r>
     </w:p>
     <w:p>
       <w:pPr>
+        <w:numPr>
+          <w:ilvl w:val="0"/>
+          <w:numId w:val="21"/>
+        </w:numPr>
         <w:jc w:val="both"/>
       </w:pPr>
       <w:r>
-        <w:t>Value-Added Ratio=Value Added in the SectorTotal Output of the Sector\</w:t>
+        <w:rPr>
+          <w:b/>
+          <w:bCs/>
+        </w:rPr>
+        <w:lastRenderedPageBreak/>
+        <w:t>Fishery Sector Total Output:</w:t>
+      </w:r>
+      <w:r>
+        <w:t xml:space="preserve"> $100 million</w:t>
+      </w:r>
+    </w:p>
+    <w:p>
+      <w:pPr>
+        <w:numPr>
+          <w:ilvl w:val="0"/>
+          <w:numId w:val="21"/>
+        </w:numPr>
+        <w:jc w:val="both"/>
+      </w:pPr>
+      <w:r>
+        <w:rPr>
+          <w:b/>
+          <w:bCs/>
+        </w:rPr>
+        <w:t>Fishery Sector Value-Added:</w:t>
+      </w:r>
+      <w:r>
+        <w:t xml:space="preserve"> $40 million</w:t>
+      </w:r>
+    </w:p>
+    <w:p>
+      <w:pPr>
+        <w:jc w:val="both"/>
+      </w:pPr>
+      <w:r>
+        <w:t xml:space="preserve">Here, the </w:t>
+      </w:r>
+      <w:r>
+        <w:rPr>
+          <w:b/>
+          <w:bCs/>
+        </w:rPr>
+        <w:t>Value-Added Ratio</w:t>
+      </w:r>
+      <w:r>
+        <w:t xml:space="preserve"> would be:</w:t>
+      </w:r>
+    </w:p>
+    <w:p>
+      <w:pPr>
+        <w:jc w:val="both"/>
+      </w:pPr>
+      <w:r>
+        <w:t>Value-Added Ratio=Value AddedTotal Output=40100=0.4 (or 40</w:t>
       </w:r>
       <w:proofErr w:type="gramStart"/>
       <w:r>
-        <w:t>text{</w:t>
+        <w:t>%)\</w:t>
       </w:r>
       <w:proofErr w:type="gramEnd"/>
       <w:r>
-        <w:t>Value-Added Ratio} = \frac{\text{Value Added in the Sector}}{\text{Total Output of the Sector}}Value-Added Ratio=Total Output of the SectorValue Added in the Sector</w:t>
+        <w:t>text{Value-Added Ratio} = \frac{\text{Value Added}}{\text{Total Output}} = \frac{40}{100} = 0.4 \text{ (or 40\%)}Value-Added Ratio=Total OutputValue Added</w:t>
       </w:r>
       <w:r>
         <w:rPr>
@@ -32149,54 +32171,34 @@
         </w:rPr>
         <w:t>​</w:t>
       </w:r>
+      <w:r>
+        <w:t>=10040</w:t>
+      </w:r>
+      <w:r>
+        <w:rPr>
+          <w:rFonts w:ascii="Arial" w:hAnsi="Arial" w:cs="Arial"/>
+        </w:rPr>
+        <w:t>​</w:t>
+      </w:r>
+      <w:r>
+        <w:t>=0.4 (or 40%)</w:t>
+      </w:r>
     </w:p>
     <w:p>
       <w:pPr>
-        <w:numPr>
-          <w:ilvl w:val="0"/>
-          <w:numId w:val="19"/>
-        </w:numPr>
         <w:jc w:val="both"/>
       </w:pPr>
-      <w:proofErr w:type="gramStart"/>
-      <w:r>
-        <w:rPr>
-          <w:b/>
-          <w:bCs/>
-        </w:rPr>
-        <w:t>Value</w:t>
-      </w:r>
-      <w:proofErr w:type="gramEnd"/>
-      <w:r>
-        <w:rPr>
-          <w:b/>
-          <w:bCs/>
-        </w:rPr>
-        <w:t xml:space="preserve"> added</w:t>
-      </w:r>
-      <w:r>
-        <w:t xml:space="preserve"> represents the net contribution of the sector after subtracting costs of intermediate goods and services (inputs).</w:t>
+      <w:r>
+        <w:t>The sector's contribution to GDP (1%) reflects the relative size of its value-added compared to the overall economy, while the value-added ratio (40%) is a measure of how efficiently the sector adds value to its production.</w:t>
       </w:r>
     </w:p>
     <w:p>
       <w:pPr>
-        <w:numPr>
-          <w:ilvl w:val="0"/>
-          <w:numId w:val="19"/>
-        </w:numPr>
         <w:jc w:val="both"/>
       </w:pPr>
       <w:r>
-        <w:t>A higher value-added ratio indicates that the sector relies less on external inputs and creates more value internally (e.g., through labor, capital, or innovation).</w:t>
-      </w:r>
-    </w:p>
-    <w:p>
-      <w:pPr>
-        <w:jc w:val="both"/>
-      </w:pPr>
-      <w:r>
-        <w:pict w14:anchorId="73B5B575">
-          <v:rect id="_x0000_i1068" style="width:0;height:1.5pt" o:hralign="center" o:hrstd="t" o:hr="t" fillcolor="#a0a0a0" stroked="f"/>
+        <w:pict w14:anchorId="094E0FFC">
+          <v:rect id="_x0000_i1026" style="width:0;height:1.5pt" o:hralign="center" o:hrstd="t" o:hr="t" fillcolor="#a0a0a0" stroked="f"/>
         </w:pict>
       </w:r>
     </w:p>
@@ -32213,11 +32215,15 @@
           <w:b/>
           <w:bCs/>
         </w:rPr>
-        <w:t>Relationship Between the Two</w:t>
+        <w:t>Key Takeaway</w:t>
       </w:r>
     </w:p>
     <w:p>
       <w:pPr>
+        <w:numPr>
+          <w:ilvl w:val="0"/>
+          <w:numId w:val="22"/>
+        </w:numPr>
         <w:jc w:val="both"/>
       </w:pPr>
       <w:r>
@@ -32231,124 +32237,19 @@
         <w:t>percentage contribution to GDP</w:t>
       </w:r>
       <w:r>
-        <w:t xml:space="preserve"> is related to the sector's </w:t>
-      </w:r>
-      <w:r>
-        <w:rPr>
-          <w:b/>
-          <w:bCs/>
-        </w:rPr>
-        <w:t>value-added</w:t>
-      </w:r>
-      <w:r>
-        <w:t>, but they are not directly interchangeable:</w:t>
+        <w:t xml:space="preserve"> tells you how much the sector contributes to the country's economy.</w:t>
       </w:r>
     </w:p>
     <w:p>
       <w:pPr>
         <w:numPr>
           <w:ilvl w:val="0"/>
-          <w:numId w:val="20"/>
+          <w:numId w:val="22"/>
         </w:numPr>
         <w:jc w:val="both"/>
       </w:pPr>
       <w:r>
-        <w:rPr>
-          <w:b/>
-          <w:bCs/>
-        </w:rPr>
-        <w:t>National GDP is based on value-added across all sectors.</w:t>
-      </w:r>
-    </w:p>
-    <w:p>
-      <w:pPr>
-        <w:numPr>
-          <w:ilvl w:val="1"/>
-          <w:numId w:val="20"/>
-        </w:numPr>
-        <w:jc w:val="both"/>
-      </w:pPr>
-      <w:r>
-        <w:t xml:space="preserve">Each sector’s contribution to GDP reflects its total </w:t>
-      </w:r>
-      <w:r>
-        <w:rPr>
-          <w:b/>
-          <w:bCs/>
-        </w:rPr>
-        <w:t>value-added</w:t>
-      </w:r>
-      <w:r>
-        <w:t xml:space="preserve"> compared to other sectors in the economy.</w:t>
-      </w:r>
-    </w:p>
-    <w:p>
-      <w:pPr>
-        <w:numPr>
-          <w:ilvl w:val="1"/>
-          <w:numId w:val="20"/>
-        </w:numPr>
-        <w:jc w:val="both"/>
-      </w:pPr>
-      <w:r>
-        <w:t>For instance, a sector with high value-added but low total output may still contribute a small percentage to the GDP if other sectors are significantly larger.</w:t>
-      </w:r>
-    </w:p>
-    <w:p>
-      <w:pPr>
-        <w:numPr>
-          <w:ilvl w:val="0"/>
-          <w:numId w:val="20"/>
-        </w:numPr>
-        <w:jc w:val="both"/>
-      </w:pPr>
-      <w:r>
-        <w:rPr>
-          <w:b/>
-          <w:bCs/>
-        </w:rPr>
-        <w:t xml:space="preserve">Value-Added Ratio is an </w:t>
-      </w:r>
-      <w:proofErr w:type="gramStart"/>
-      <w:r>
-        <w:rPr>
-          <w:b/>
-          <w:bCs/>
-        </w:rPr>
-        <w:t>efficiency</w:t>
-      </w:r>
-      <w:proofErr w:type="gramEnd"/>
-      <w:r>
-        <w:rPr>
-          <w:b/>
-          <w:bCs/>
-        </w:rPr>
-        <w:t xml:space="preserve"> metric within the sector.</w:t>
-      </w:r>
-    </w:p>
-    <w:p>
-      <w:pPr>
-        <w:numPr>
-          <w:ilvl w:val="1"/>
-          <w:numId w:val="20"/>
-        </w:numPr>
-        <w:jc w:val="both"/>
-      </w:pPr>
-      <w:r>
-        <w:t>It measures how efficiently a sector generates value from its total output.</w:t>
-      </w:r>
-    </w:p>
-    <w:p>
-      <w:pPr>
-        <w:numPr>
-          <w:ilvl w:val="1"/>
-          <w:numId w:val="20"/>
-        </w:numPr>
-        <w:jc w:val="both"/>
-      </w:pPr>
-      <w:r>
-        <w:lastRenderedPageBreak/>
-        <w:t xml:space="preserve">Even if the fishery sector in Belize contributes 1% to the national GDP, its </w:t>
+        <w:t xml:space="preserve">The </w:t>
       </w:r>
       <w:r>
         <w:rPr>
@@ -32358,7 +32259,7 @@
         <w:t>value-added ratio</w:t>
       </w:r>
       <w:r>
-        <w:t xml:space="preserve"> depends on how much value it creates relative to its inputs and total production.</w:t>
+        <w:t xml:space="preserve"> tells you how much of the sector's output is retained as value after accounting for intermediate inputs.</w:t>
       </w:r>
     </w:p>
     <w:p>
@@ -32366,309 +32267,15 @@
         <w:jc w:val="both"/>
       </w:pPr>
       <w:r>
-        <w:pict w14:anchorId="1CFF4D88">
-          <v:rect id="_x0000_i1069" style="width:0;height:1.5pt" o:hralign="center" o:hrstd="t" o:hr="t" fillcolor="#a0a0a0" stroked="f"/>
-        </w:pict>
+        <w:t>4o</w:t>
       </w:r>
     </w:p>
     <w:p>
       <w:pPr>
         <w:jc w:val="both"/>
-        <w:rPr>
-          <w:b/>
-          <w:bCs/>
-        </w:rPr>
-      </w:pPr>
-      <w:r>
-        <w:rPr>
-          <w:b/>
-          <w:bCs/>
-        </w:rPr>
-        <w:t>Example</w:t>
-      </w:r>
-    </w:p>
-    <w:p>
-      <w:pPr>
-        <w:numPr>
-          <w:ilvl w:val="0"/>
-          <w:numId w:val="21"/>
-        </w:numPr>
-        <w:jc w:val="both"/>
-      </w:pPr>
-      <w:r>
-        <w:rPr>
-          <w:b/>
-          <w:bCs/>
-        </w:rPr>
-        <w:t>Fishery Sector Contribution to GDP:</w:t>
-      </w:r>
-      <w:r>
-        <w:t xml:space="preserve"> 1%</w:t>
-      </w:r>
-    </w:p>
-    <w:p>
-      <w:pPr>
-        <w:numPr>
-          <w:ilvl w:val="0"/>
-          <w:numId w:val="21"/>
-        </w:numPr>
-        <w:jc w:val="both"/>
-      </w:pPr>
-      <w:r>
-        <w:rPr>
-          <w:b/>
-          <w:bCs/>
-        </w:rPr>
-        <w:t>Fishery Sector Total Output:</w:t>
-      </w:r>
-      <w:r>
-        <w:t xml:space="preserve"> $100 million</w:t>
-      </w:r>
-    </w:p>
-    <w:p>
-      <w:pPr>
-        <w:numPr>
-          <w:ilvl w:val="0"/>
-          <w:numId w:val="21"/>
-        </w:numPr>
-        <w:jc w:val="both"/>
-      </w:pPr>
-      <w:r>
-        <w:rPr>
-          <w:b/>
-          <w:bCs/>
-        </w:rPr>
-        <w:t>Fishery Sector Value-Added:</w:t>
-      </w:r>
-      <w:r>
-        <w:t xml:space="preserve"> $40 million</w:t>
-      </w:r>
-    </w:p>
-    <w:p>
-      <w:pPr>
-        <w:jc w:val="both"/>
-      </w:pPr>
-      <w:r>
-        <w:t xml:space="preserve">Here, the </w:t>
-      </w:r>
-      <w:r>
-        <w:rPr>
-          <w:b/>
-          <w:bCs/>
-        </w:rPr>
-        <w:t>Value-Added Ratio</w:t>
-      </w:r>
-      <w:r>
-        <w:t xml:space="preserve"> would be:</w:t>
-      </w:r>
-    </w:p>
-    <w:p>
-      <w:pPr>
-        <w:jc w:val="both"/>
-      </w:pPr>
-      <w:r>
-        <w:t>Value-Added Ratio=Value AddedTotal Output=40100=0.4 (or 40</w:t>
-      </w:r>
-      <w:proofErr w:type="gramStart"/>
-      <w:r>
-        <w:t>%)\</w:t>
-      </w:r>
-      <w:proofErr w:type="gramEnd"/>
-      <w:r>
-        <w:t>text{Value-Added Ratio} = \frac{\text{Value Added}}{\text{Total Output}} = \frac{40}{100} = 0.4 \text{ (or 40\%)}Value-Added Ratio=Total OutputValue Added</w:t>
-      </w:r>
-      <w:r>
-        <w:rPr>
-          <w:rFonts w:ascii="Arial" w:hAnsi="Arial" w:cs="Arial"/>
-        </w:rPr>
-        <w:t>​</w:t>
-      </w:r>
-      <w:r>
-        <w:t>=10040</w:t>
-      </w:r>
-      <w:r>
-        <w:rPr>
-          <w:rFonts w:ascii="Arial" w:hAnsi="Arial" w:cs="Arial"/>
-        </w:rPr>
-        <w:t>​</w:t>
-      </w:r>
-      <w:r>
-        <w:t>=0.4 (or 40%)</w:t>
-      </w:r>
-    </w:p>
-    <w:p>
-      <w:pPr>
-        <w:jc w:val="both"/>
-      </w:pPr>
-      <w:r>
-        <w:t>The sector's contribution to GDP (1%) reflects the relative size of its value-added compared to the overall economy, while the value-added ratio (40%) is a measure of how efficiently the sector adds value to its production.</w:t>
-      </w:r>
-    </w:p>
-    <w:p>
-      <w:pPr>
-        <w:jc w:val="both"/>
-      </w:pPr>
-      <w:r>
-        <w:pict w14:anchorId="094E0FFC">
-          <v:rect id="_x0000_i1070" style="width:0;height:1.5pt" o:hralign="center" o:hrstd="t" o:hr="t" fillcolor="#a0a0a0" stroked="f"/>
-        </w:pict>
-      </w:r>
-    </w:p>
-    <w:p>
-      <w:pPr>
-        <w:jc w:val="both"/>
-        <w:rPr>
-          <w:b/>
-          <w:bCs/>
-        </w:rPr>
-      </w:pPr>
-      <w:r>
-        <w:rPr>
-          <w:b/>
-          <w:bCs/>
-        </w:rPr>
-        <w:t>Key Takeaway</w:t>
-      </w:r>
-    </w:p>
-    <w:p>
-      <w:pPr>
-        <w:numPr>
-          <w:ilvl w:val="0"/>
-          <w:numId w:val="22"/>
-        </w:numPr>
-        <w:jc w:val="both"/>
-      </w:pPr>
-      <w:r>
-        <w:t xml:space="preserve">The </w:t>
-      </w:r>
-      <w:r>
-        <w:rPr>
-          <w:b/>
-          <w:bCs/>
-        </w:rPr>
-        <w:t>percentage contribution to GDP</w:t>
-      </w:r>
-      <w:r>
-        <w:t xml:space="preserve"> tells you how much the sector contributes to the country's economy.</w:t>
-      </w:r>
-    </w:p>
-    <w:p>
-      <w:pPr>
-        <w:numPr>
-          <w:ilvl w:val="0"/>
-          <w:numId w:val="22"/>
-        </w:numPr>
-        <w:jc w:val="both"/>
-      </w:pPr>
-      <w:r>
-        <w:t xml:space="preserve">The </w:t>
-      </w:r>
-      <w:r>
-        <w:rPr>
-          <w:b/>
-          <w:bCs/>
-        </w:rPr>
-        <w:t>value-added ratio</w:t>
-      </w:r>
-      <w:r>
-        <w:t xml:space="preserve"> tells you how much of the sector's output is retained as value after accounting for intermediate inputs.</w:t>
-      </w:r>
-    </w:p>
-    <w:p>
-      <w:pPr>
-        <w:jc w:val="both"/>
-      </w:pPr>
-      <w:r>
-        <w:t>4o</w:t>
-      </w:r>
-    </w:p>
-    <w:p>
-      <w:pPr>
-        <w:jc w:val="both"/>
-        <w:rPr>
-          <w:b/>
-          <w:bCs/>
-        </w:rPr>
-      </w:pPr>
-      <w:proofErr w:type="spellStart"/>
-      <w:r>
-        <w:rPr>
-          <w:b/>
-          <w:bCs/>
-        </w:rPr>
-        <w:t>Você</w:t>
-      </w:r>
-      <w:proofErr w:type="spellEnd"/>
-      <w:r>
-        <w:rPr>
-          <w:b/>
-          <w:bCs/>
-        </w:rPr>
-        <w:t xml:space="preserve"> </w:t>
-      </w:r>
-      <w:proofErr w:type="spellStart"/>
-      <w:r>
-        <w:rPr>
-          <w:b/>
-          <w:bCs/>
-        </w:rPr>
-        <w:t>disse</w:t>
-      </w:r>
-      <w:proofErr w:type="spellEnd"/>
-      <w:r>
-        <w:rPr>
-          <w:b/>
-          <w:bCs/>
-        </w:rPr>
-        <w:t>:</w:t>
-      </w:r>
-    </w:p>
-    <w:p>
-      <w:pPr>
-        <w:jc w:val="both"/>
       </w:pPr>
       <w:r>
         <w:t>can you obtain the most updated fishery statistics available from Belize to estimate the Value-added ratio? and give me the references</w:t>
-      </w:r>
-    </w:p>
-    <w:p>
-      <w:pPr>
-        <w:jc w:val="both"/>
-        <w:rPr>
-          <w:b/>
-          <w:bCs/>
-        </w:rPr>
-      </w:pPr>
-      <w:r>
-        <w:rPr>
-          <w:b/>
-          <w:bCs/>
-        </w:rPr>
-        <w:t xml:space="preserve">O ChatGPT </w:t>
-      </w:r>
-      <w:proofErr w:type="spellStart"/>
-      <w:r>
-        <w:rPr>
-          <w:b/>
-          <w:bCs/>
-        </w:rPr>
-        <w:t>disse</w:t>
-      </w:r>
-      <w:proofErr w:type="spellEnd"/>
-      <w:r>
-        <w:rPr>
-          <w:b/>
-          <w:bCs/>
-        </w:rPr>
-        <w:t>:</w:t>
-      </w:r>
-    </w:p>
-    <w:p>
-      <w:pPr>
-        <w:jc w:val="both"/>
-      </w:pPr>
-      <w:r>
-        <w:t>ChatGPT</w:t>
       </w:r>
     </w:p>
     <w:p>
@@ -32713,7 +32320,6 @@
         <w:jc w:val="both"/>
       </w:pPr>
       <w:r>
-        <w:lastRenderedPageBreak/>
         <w:t xml:space="preserve">Additionally, the Food and Agriculture Organization reported that the fisheries sector accounted for 3% of Belize's GDP in 2015. </w:t>
       </w:r>
     </w:p>
@@ -32791,6 +32397,7 @@
           <w:b/>
           <w:bCs/>
         </w:rPr>
+        <w:lastRenderedPageBreak/>
         <w:t>Belize - Fishery and Aquaculture Country Profiles</w:t>
       </w:r>
       <w:r>
@@ -32861,17 +32468,179 @@
     <w:p>
       <w:pPr>
         <w:jc w:val="both"/>
-      </w:pPr>
-      <w:r>
-        <w:t>Fontes</w:t>
+        <w:rPr>
+          <w:b/>
+          <w:bCs/>
+        </w:rPr>
+      </w:pPr>
+      <w:r>
+        <w:rPr>
+          <w:b/>
+          <w:bCs/>
+        </w:rPr>
+        <w:t>Definitions:</w:t>
       </w:r>
     </w:p>
     <w:p>
       <w:pPr>
+        <w:numPr>
+          <w:ilvl w:val="0"/>
+          <w:numId w:val="24"/>
+        </w:numPr>
         <w:jc w:val="both"/>
       </w:pPr>
       <w:r>
-        <w:t>4o</w:t>
+        <w:rPr>
+          <w:b/>
+          <w:bCs/>
+        </w:rPr>
+        <w:t>Fishery Sector Total Output:</w:t>
+      </w:r>
+    </w:p>
+    <w:p>
+      <w:pPr>
+        <w:numPr>
+          <w:ilvl w:val="1"/>
+          <w:numId w:val="24"/>
+        </w:numPr>
+        <w:jc w:val="both"/>
+      </w:pPr>
+      <w:r>
+        <w:t xml:space="preserve">This represents the </w:t>
+      </w:r>
+      <w:r>
+        <w:rPr>
+          <w:b/>
+          <w:bCs/>
+        </w:rPr>
+        <w:t>total value of goods and services produced</w:t>
+      </w:r>
+      <w:r>
+        <w:t xml:space="preserve"> by the fisheries sector in a given period, typically within one year.</w:t>
+      </w:r>
+    </w:p>
+    <w:p>
+      <w:pPr>
+        <w:numPr>
+          <w:ilvl w:val="1"/>
+          <w:numId w:val="24"/>
+        </w:numPr>
+        <w:jc w:val="both"/>
+      </w:pPr>
+      <w:r>
+        <w:t xml:space="preserve">It includes </w:t>
+      </w:r>
+      <w:r>
+        <w:rPr>
+          <w:b/>
+          <w:bCs/>
+        </w:rPr>
+        <w:t>intermediate outputs</w:t>
+      </w:r>
+      <w:r>
+        <w:t xml:space="preserve"> (goods and services used in production) and </w:t>
+      </w:r>
+      <w:r>
+        <w:rPr>
+          <w:b/>
+          <w:bCs/>
+        </w:rPr>
+        <w:t>final outputs</w:t>
+      </w:r>
+      <w:r>
+        <w:t xml:space="preserve"> (goods and services sold to consumers or other sectors).</w:t>
+      </w:r>
+    </w:p>
+    <w:p>
+      <w:pPr>
+        <w:numPr>
+          <w:ilvl w:val="1"/>
+          <w:numId w:val="24"/>
+        </w:numPr>
+        <w:jc w:val="both"/>
+      </w:pPr>
+      <w:r>
+        <w:t>Example: Revenue generated by fish harvests, aquaculture, and seafood processing before subtracting costs.</w:t>
+      </w:r>
+    </w:p>
+    <w:p>
+      <w:pPr>
+        <w:numPr>
+          <w:ilvl w:val="0"/>
+          <w:numId w:val="24"/>
+        </w:numPr>
+        <w:jc w:val="both"/>
+      </w:pPr>
+      <w:r>
+        <w:rPr>
+          <w:b/>
+          <w:bCs/>
+        </w:rPr>
+        <w:t>Fishery Sector Value-Added:</w:t>
+      </w:r>
+    </w:p>
+    <w:p>
+      <w:pPr>
+        <w:numPr>
+          <w:ilvl w:val="1"/>
+          <w:numId w:val="24"/>
+        </w:numPr>
+        <w:jc w:val="both"/>
+      </w:pPr>
+      <w:r>
+        <w:t xml:space="preserve">This represents the </w:t>
+      </w:r>
+      <w:r>
+        <w:rPr>
+          <w:b/>
+          <w:bCs/>
+        </w:rPr>
+        <w:t>sector's contribution to the GDP</w:t>
+      </w:r>
+      <w:r>
+        <w:t xml:space="preserve">, calculated as the total output </w:t>
+      </w:r>
+      <w:r>
+        <w:rPr>
+          <w:b/>
+          <w:bCs/>
+        </w:rPr>
+        <w:t>minus the value of intermediate inputs</w:t>
+      </w:r>
+      <w:r>
+        <w:t xml:space="preserve"> (e.g., cost of fishing gear, fuel, and bait).</w:t>
+      </w:r>
+    </w:p>
+    <w:p>
+      <w:pPr>
+        <w:numPr>
+          <w:ilvl w:val="1"/>
+          <w:numId w:val="24"/>
+        </w:numPr>
+        <w:jc w:val="both"/>
+      </w:pPr>
+      <w:r>
+        <w:t xml:space="preserve">It reflects the </w:t>
+      </w:r>
+      <w:r>
+        <w:rPr>
+          <w:b/>
+          <w:bCs/>
+        </w:rPr>
+        <w:t>net economic contribution</w:t>
+      </w:r>
+      <w:r>
+        <w:t xml:space="preserve"> of the fisheries sector, including wages, profits, and taxes.</w:t>
+      </w:r>
+    </w:p>
+    <w:p>
+      <w:pPr>
+        <w:jc w:val="both"/>
+      </w:pPr>
+      <w:r>
+        <w:pict w14:anchorId="12C7E528">
+          <v:rect id="_x0000_i1027" style="width:0;height:1.5pt" o:hralign="center" o:hrstd="t" o:hr="t" fillcolor="#a0a0a0" stroked="f"/>
+        </w:pict>
       </w:r>
     </w:p>
     <w:p>
@@ -32882,121 +32651,19 @@
           <w:bCs/>
         </w:rPr>
       </w:pPr>
-      <w:proofErr w:type="spellStart"/>
       <w:r>
         <w:rPr>
           <w:b/>
           <w:bCs/>
         </w:rPr>
-        <w:t>Você</w:t>
-      </w:r>
-      <w:proofErr w:type="spellEnd"/>
-      <w:r>
-        <w:rPr>
-          <w:b/>
-          <w:bCs/>
-        </w:rPr>
-        <w:t xml:space="preserve"> </w:t>
-      </w:r>
-      <w:proofErr w:type="spellStart"/>
-      <w:r>
-        <w:rPr>
-          <w:b/>
-          <w:bCs/>
-        </w:rPr>
-        <w:t>disse</w:t>
-      </w:r>
-      <w:proofErr w:type="spellEnd"/>
-      <w:r>
-        <w:rPr>
-          <w:b/>
-          <w:bCs/>
-        </w:rPr>
-        <w:t>:</w:t>
+        <w:t>How to Find These Values:</w:t>
       </w:r>
     </w:p>
     <w:p>
       <w:pPr>
-        <w:jc w:val="both"/>
-      </w:pPr>
-      <w:r>
-        <w:t>1004</w:t>
-      </w:r>
-    </w:p>
-    <w:p>
-      <w:pPr>
-        <w:jc w:val="both"/>
-      </w:pPr>
-      <w:proofErr w:type="gramStart"/>
-      <w:r>
-        <w:t>what</w:t>
-      </w:r>
-      <w:proofErr w:type="gramEnd"/>
-      <w:r>
-        <w:t xml:space="preserve"> means the Fishery Sector Total Output and the Fishery Sector Value-Added? how can I find those values?</w:t>
-      </w:r>
-    </w:p>
-    <w:p>
-      <w:pPr>
-        <w:jc w:val="both"/>
-        <w:rPr>
-          <w:b/>
-          <w:bCs/>
-        </w:rPr>
-      </w:pPr>
-      <w:r>
-        <w:rPr>
-          <w:b/>
-          <w:bCs/>
-        </w:rPr>
-        <w:t xml:space="preserve">O ChatGPT </w:t>
-      </w:r>
-      <w:proofErr w:type="spellStart"/>
-      <w:r>
-        <w:rPr>
-          <w:b/>
-          <w:bCs/>
-        </w:rPr>
-        <w:t>disse</w:t>
-      </w:r>
-      <w:proofErr w:type="spellEnd"/>
-      <w:r>
-        <w:rPr>
-          <w:b/>
-          <w:bCs/>
-        </w:rPr>
-        <w:t>:</w:t>
-      </w:r>
-    </w:p>
-    <w:p>
-      <w:pPr>
-        <w:jc w:val="both"/>
-      </w:pPr>
-      <w:r>
-        <w:t>ChatGPT</w:t>
-      </w:r>
-    </w:p>
-    <w:p>
-      <w:pPr>
-        <w:jc w:val="both"/>
-        <w:rPr>
-          <w:b/>
-          <w:bCs/>
-        </w:rPr>
-      </w:pPr>
-      <w:r>
-        <w:rPr>
-          <w:b/>
-          <w:bCs/>
-        </w:rPr>
-        <w:t>Definitions:</w:t>
-      </w:r>
-    </w:p>
-    <w:p>
-      <w:pPr>
         <w:numPr>
           <w:ilvl w:val="0"/>
-          <w:numId w:val="24"/>
+          <w:numId w:val="25"/>
         </w:numPr>
         <w:jc w:val="both"/>
       </w:pPr>
@@ -33012,74 +32679,41 @@
       <w:pPr>
         <w:numPr>
           <w:ilvl w:val="1"/>
-          <w:numId w:val="24"/>
+          <w:numId w:val="25"/>
         </w:numPr>
         <w:jc w:val="both"/>
       </w:pPr>
       <w:r>
-        <w:t xml:space="preserve">This represents the </w:t>
+        <w:t xml:space="preserve">Look for </w:t>
       </w:r>
       <w:r>
         <w:rPr>
           <w:b/>
           <w:bCs/>
         </w:rPr>
-        <w:t>total value of goods and services produced</w:t>
-      </w:r>
-      <w:r>
-        <w:t xml:space="preserve"> by the fisheries sector in a given period, typically within one year.</w:t>
+        <w:t>gross revenue or gross output</w:t>
+      </w:r>
+      <w:r>
+        <w:t xml:space="preserve"> figures from government or industry reports.</w:t>
       </w:r>
     </w:p>
     <w:p>
       <w:pPr>
         <w:numPr>
           <w:ilvl w:val="1"/>
-          <w:numId w:val="24"/>
+          <w:numId w:val="25"/>
         </w:numPr>
         <w:jc w:val="both"/>
       </w:pPr>
       <w:r>
-        <w:t xml:space="preserve">It includes </w:t>
-      </w:r>
-      <w:r>
-        <w:rPr>
-          <w:b/>
-          <w:bCs/>
-        </w:rPr>
-        <w:t>intermediate outputs</w:t>
-      </w:r>
-      <w:r>
-        <w:t xml:space="preserve"> (goods and services used in production) and </w:t>
-      </w:r>
-      <w:r>
-        <w:rPr>
-          <w:b/>
-          <w:bCs/>
-        </w:rPr>
-        <w:t>final outputs</w:t>
-      </w:r>
-      <w:r>
-        <w:t xml:space="preserve"> (goods and services sold to consumers or other sectors).</w:t>
+        <w:t>Check national accounts, sector-specific surveys, or production statistics. For Belize, organizations like the Ministry of Agriculture, Fisheries, Forestry, and the Environment might publish such data.</w:t>
       </w:r>
     </w:p>
     <w:p>
       <w:pPr>
         <w:numPr>
-          <w:ilvl w:val="1"/>
-          <w:numId w:val="24"/>
-        </w:numPr>
-        <w:jc w:val="both"/>
-      </w:pPr>
-      <w:r>
-        <w:lastRenderedPageBreak/>
-        <w:t>Example: Revenue generated by fish harvests, aquaculture, and seafood processing before subtracting costs.</w:t>
-      </w:r>
-    </w:p>
-    <w:p>
-      <w:pPr>
-        <w:numPr>
           <w:ilvl w:val="0"/>
-          <w:numId w:val="24"/>
+          <w:numId w:val="25"/>
         </w:numPr>
         <w:jc w:val="both"/>
       </w:pPr>
@@ -33095,96 +32729,12 @@
       <w:pPr>
         <w:numPr>
           <w:ilvl w:val="1"/>
-          <w:numId w:val="24"/>
-        </w:numPr>
-        <w:jc w:val="both"/>
-      </w:pPr>
-      <w:r>
-        <w:t xml:space="preserve">This represents the </w:t>
-      </w:r>
-      <w:r>
-        <w:rPr>
-          <w:b/>
-          <w:bCs/>
-        </w:rPr>
-        <w:t>sector's contribution to the GDP</w:t>
-      </w:r>
-      <w:r>
-        <w:t xml:space="preserve">, calculated as the total output </w:t>
-      </w:r>
-      <w:r>
-        <w:rPr>
-          <w:b/>
-          <w:bCs/>
-        </w:rPr>
-        <w:t>minus the value of intermediate inputs</w:t>
-      </w:r>
-      <w:r>
-        <w:t xml:space="preserve"> (e.g., cost of fishing gear, fuel, and bait).</w:t>
-      </w:r>
-    </w:p>
-    <w:p>
-      <w:pPr>
-        <w:numPr>
-          <w:ilvl w:val="1"/>
-          <w:numId w:val="24"/>
-        </w:numPr>
-        <w:jc w:val="both"/>
-      </w:pPr>
-      <w:r>
-        <w:t xml:space="preserve">It reflects the </w:t>
-      </w:r>
-      <w:r>
-        <w:rPr>
-          <w:b/>
-          <w:bCs/>
-        </w:rPr>
-        <w:t>net economic contribution</w:t>
-      </w:r>
-      <w:r>
-        <w:t xml:space="preserve"> of the fisheries sector, including wages, profits, and taxes.</w:t>
-      </w:r>
-    </w:p>
-    <w:p>
-      <w:pPr>
-        <w:jc w:val="both"/>
-      </w:pPr>
-      <w:r>
-        <w:pict w14:anchorId="12C7E528">
-          <v:rect id="_x0000_i1071" style="width:0;height:1.5pt" o:hralign="center" o:hrstd="t" o:hr="t" fillcolor="#a0a0a0" stroked="f"/>
-        </w:pict>
-      </w:r>
-    </w:p>
-    <w:p>
-      <w:pPr>
-        <w:jc w:val="both"/>
-        <w:rPr>
-          <w:b/>
-          <w:bCs/>
-        </w:rPr>
-      </w:pPr>
-      <w:r>
-        <w:rPr>
-          <w:b/>
-          <w:bCs/>
-        </w:rPr>
-        <w:t>How to Find These Values:</w:t>
-      </w:r>
-    </w:p>
-    <w:p>
-      <w:pPr>
-        <w:numPr>
-          <w:ilvl w:val="0"/>
           <w:numId w:val="25"/>
         </w:numPr>
         <w:jc w:val="both"/>
       </w:pPr>
       <w:r>
-        <w:rPr>
-          <w:b/>
-          <w:bCs/>
-        </w:rPr>
-        <w:t>Fishery Sector Total Output:</w:t>
+        <w:t>Look for GDP contributions reported by the national statistical office or international organizations like the FAO or the World Bank.</w:t>
       </w:r>
     </w:p>
     <w:p>
@@ -33196,17 +32746,7 @@
         <w:jc w:val="both"/>
       </w:pPr>
       <w:r>
-        <w:t xml:space="preserve">Look for </w:t>
-      </w:r>
-      <w:r>
-        <w:rPr>
-          <w:b/>
-          <w:bCs/>
-        </w:rPr>
-        <w:t>gross revenue or gross output</w:t>
-      </w:r>
-      <w:r>
-        <w:t xml:space="preserve"> figures from government or industry reports.</w:t>
+        <w:t>Use economic reports or input-output tables for the fisheries sector.</w:t>
       </w:r>
     </w:p>
     <w:p>
@@ -33218,23 +32758,8 @@
         <w:jc w:val="both"/>
       </w:pPr>
       <w:r>
-        <w:t>Check national accounts, sector-specific surveys, or production statistics. For Belize, organizations like the Ministry of Agriculture, Fisheries, Forestry, and the Environment might publish such data.</w:t>
-      </w:r>
-    </w:p>
-    <w:p>
-      <w:pPr>
-        <w:numPr>
-          <w:ilvl w:val="0"/>
-          <w:numId w:val="25"/>
-        </w:numPr>
-        <w:jc w:val="both"/>
-      </w:pPr>
-      <w:r>
-        <w:rPr>
-          <w:b/>
-          <w:bCs/>
-        </w:rPr>
-        <w:t>Fishery Sector Value-Added:</w:t>
+        <w:lastRenderedPageBreak/>
+        <w:t xml:space="preserve">If the value-added isn't reported directly, you can estimate it using the formula: </w:t>
       </w:r>
     </w:p>
     <w:p>
@@ -33246,48 +32771,41 @@
         <w:jc w:val="both"/>
       </w:pPr>
       <w:r>
-        <w:t>Look for GDP contributions reported by the national statistical office or international organizations like the FAO or the World Bank.</w:t>
+        <w:t>Value-Added=Total Output−Intermediate Inputs\</w:t>
+      </w:r>
+      <w:proofErr w:type="gramStart"/>
+      <w:r>
+        <w:t>text{</w:t>
+      </w:r>
+      <w:proofErr w:type="gramEnd"/>
+      <w:r>
+        <w:t xml:space="preserve">Value-Added} = \text{Total Output} - \text{Intermediate Inputs}Value-Added=Total Output−Intermediate Inputs </w:t>
       </w:r>
     </w:p>
     <w:p>
       <w:pPr>
-        <w:numPr>
-          <w:ilvl w:val="1"/>
-          <w:numId w:val="25"/>
-        </w:numPr>
+        <w:ind w:left="1440"/>
         <w:jc w:val="both"/>
       </w:pPr>
       <w:r>
-        <w:t>Use economic reports or input-output tables for the fisheries sector.</w:t>
+        <w:t xml:space="preserve"> will need data on the costs of </w:t>
+      </w:r>
+      <w:proofErr w:type="gramStart"/>
+      <w:r>
+        <w:t>inputs</w:t>
+      </w:r>
+      <w:proofErr w:type="gramEnd"/>
+      <w:r>
+        <w:t xml:space="preserve"> (e.g., labor, equipment, fuel).</w:t>
       </w:r>
     </w:p>
     <w:p>
       <w:pPr>
-        <w:numPr>
-          <w:ilvl w:val="1"/>
-          <w:numId w:val="25"/>
-        </w:numPr>
         <w:jc w:val="both"/>
       </w:pPr>
       <w:r>
-        <w:t>If the value-added isn't reported directly, you can estimate it using the formula: Value-Added=Total Output−Intermediate Inputs\</w:t>
-      </w:r>
-      <w:proofErr w:type="gramStart"/>
-      <w:r>
-        <w:t>text{</w:t>
-      </w:r>
-      <w:proofErr w:type="gramEnd"/>
-      <w:r>
-        <w:t>Value-Added} = \text{Total Output} - \text{Intermediate Inputs}Value-Added=Total Output−Intermediate Inputs You will need data on the costs of inputs (e.g., labor, equipment, fuel).</w:t>
-      </w:r>
-    </w:p>
-    <w:p>
-      <w:pPr>
-        <w:jc w:val="both"/>
-      </w:pPr>
-      <w:r>
         <w:pict w14:anchorId="19AEE243">
-          <v:rect id="_x0000_i1072" style="width:0;height:1.5pt" o:hralign="center" o:hrstd="t" o:hr="t" fillcolor="#a0a0a0" stroked="f"/>
+          <v:rect id="_x0000_i1028" style="width:0;height:1.5pt" o:hralign="center" o:hrstd="t" o:hr="t" fillcolor="#a0a0a0" stroked="f"/>
         </w:pict>
       </w:r>
     </w:p>
@@ -33440,7 +32958,6 @@
         <w:jc w:val="both"/>
       </w:pPr>
       <w:r>
-        <w:lastRenderedPageBreak/>
         <w:t xml:space="preserve">Website: </w:t>
       </w:r>
       <w:hyperlink r:id="rId26" w:tgtFrame="_new" w:history="1">
@@ -33526,7 +33043,7 @@
       </w:pPr>
       <w:r>
         <w:pict w14:anchorId="652AD6B1">
-          <v:rect id="_x0000_i1073" style="width:0;height:1.5pt" o:hralign="center" o:hrstd="t" o:hr="t" fillcolor="#a0a0a0" stroked="f"/>
+          <v:rect id="_x0000_i1029" style="width:0;height:1.5pt" o:hralign="center" o:hrstd="t" o:hr="t" fillcolor="#a0a0a0" stroked="f"/>
         </w:pict>
       </w:r>
     </w:p>
@@ -33628,7 +33145,7 @@
 </file>
 
 <file path=word/numbering.xml><?xml version="1.0" encoding="utf-8"?>
-<w:numbering xmlns:wpc="http://schemas.microsoft.com/office/word/2010/wordprocessingCanvas" xmlns:cx="http://schemas.microsoft.com/office/drawing/2014/chartex" xmlns:cx1="http://schemas.microsoft.com/office/drawing/2015/9/8/chartex" xmlns:cx2="http://schemas.microsoft.com/office/drawing/2015/10/21/chartex" xmlns:cx3="http://schemas.microsoft.com/office/drawing/2016/5/9/chartex" xmlns:cx4="http://schemas.microsoft.com/office/drawing/2016/5/10/chartex" xmlns:cx5="http://schemas.microsoft.com/office/drawing/2016/5/11/chartex" xmlns:cx6="http://schemas.microsoft.com/office/drawing/2016/5/12/chartex" xmlns:cx7="http://schemas.microsoft.com/office/drawing/2016/5/13/chartex" xmlns:cx8="http://schemas.microsoft.com/office/drawing/2016/5/14/chartex" xmlns:mc="http://schemas.openxmlformats.org/markup-compatibility/2006" xmlns:aink="http://schemas.microsoft.com/office/drawing/2016/ink" xmlns:am3d="http://schemas.microsoft.com/office/drawing/2017/model3d" xmlns:o="urn:schemas-microsoft-com:office:office" xmlns:oel="http://schemas.microsoft.com/office/2019/extlst" xmlns:r="http://schemas.openxmlformats.org/officeDocument/2006/relationships" xmlns:m="http://schemas.openxmlformats.org/officeDocument/2006/math" xmlns:v="urn:schemas-microsoft-com:vml" xmlns:wp14="http://schemas.microsoft.com/office/word/2010/wordprocessingDrawing" xmlns:wp="http://schemas.openxmlformats.org/drawingml/2006/wordprocessingDrawing" xmlns:w10="urn:schemas-microsoft-com:office:word" xmlns:w="http://schemas.openxmlformats.org/wordprocessingml/2006/main" xmlns:w14="http://schemas.microsoft.com/office/word/2010/wordml" xmlns:w15="http://schemas.microsoft.com/office/word/2012/wordml" xmlns:w16cex="http://schemas.microsoft.com/office/word/2018/wordml/cex" xmlns:w16cid="http://schemas.microsoft.com/office/word/2016/wordml/cid" xmlns:w16="http://schemas.microsoft.com/office/word/2018/wordml" xmlns:w16du="http://schemas.microsoft.com/office/word/2023/wordml/word16du" xmlns:w16sdtdh="http://schemas.microsoft.com/office/word/2020/wordml/sdtdatahash" xmlns:w16se="http://schemas.microsoft.com/office/word/2015/wordml/symex" xmlns:wpg="http://schemas.microsoft.com/office/word/2010/wordprocessingGroup" xmlns:wpi="http://schemas.microsoft.com/office/word/2010/wordprocessingInk" xmlns:wne="http://schemas.microsoft.com/office/word/2006/wordml" xmlns:wps="http://schemas.microsoft.com/office/word/2010/wordprocessingShape" mc:Ignorable="w14 w15 w16se w16cid w16 w16cex w16sdtdh w16du wp14">
+<w:numbering xmlns:wpc="http://schemas.microsoft.com/office/word/2010/wordprocessingCanvas" xmlns:cx="http://schemas.microsoft.com/office/drawing/2014/chartex" xmlns:cx1="http://schemas.microsoft.com/office/drawing/2015/9/8/chartex" xmlns:cx2="http://schemas.microsoft.com/office/drawing/2015/10/21/chartex" xmlns:cx3="http://schemas.microsoft.com/office/drawing/2016/5/9/chartex" xmlns:cx4="http://schemas.microsoft.com/office/drawing/2016/5/10/chartex" xmlns:cx5="http://schemas.microsoft.com/office/drawing/2016/5/11/chartex" xmlns:cx6="http://schemas.microsoft.com/office/drawing/2016/5/12/chartex" xmlns:cx7="http://schemas.microsoft.com/office/drawing/2016/5/13/chartex" xmlns:cx8="http://schemas.microsoft.com/office/drawing/2016/5/14/chartex" xmlns:mc="http://schemas.openxmlformats.org/markup-compatibility/2006" xmlns:aink="http://schemas.microsoft.com/office/drawing/2016/ink" xmlns:am3d="http://schemas.microsoft.com/office/drawing/2017/model3d" xmlns:o="urn:schemas-microsoft-com:office:office" xmlns:oel="http://schemas.microsoft.com/office/2019/extlst" xmlns:r="http://schemas.openxmlformats.org/officeDocument/2006/relationships" xmlns:m="http://schemas.openxmlformats.org/officeDocument/2006/math" xmlns:v="urn:schemas-microsoft-com:vml" xmlns:wp14="http://schemas.microsoft.com/office/word/2010/wordprocessingDrawing" xmlns:wp="http://schemas.openxmlformats.org/drawingml/2006/wordprocessingDrawing" xmlns:w10="urn:schemas-microsoft-com:office:word" xmlns:w="http://schemas.openxmlformats.org/wordprocessingml/2006/main" xmlns:w14="http://schemas.microsoft.com/office/word/2010/wordml" xmlns:w15="http://schemas.microsoft.com/office/word/2012/wordml" xmlns:w16cex="http://schemas.microsoft.com/office/word/2018/wordml/cex" xmlns:w16cid="http://schemas.microsoft.com/office/word/2016/wordml/cid" xmlns:w16="http://schemas.microsoft.com/office/word/2018/wordml" xmlns:w16du="http://schemas.microsoft.com/office/word/2023/wordml/word16du" xmlns:w16sdtdh="http://schemas.microsoft.com/office/word/2020/wordml/sdtdatahash" xmlns:w16sdtfl="http://schemas.microsoft.com/office/word/2024/wordml/sdtformatlock" xmlns:w16se="http://schemas.microsoft.com/office/word/2015/wordml/symex" xmlns:wpg="http://schemas.microsoft.com/office/word/2010/wordprocessingGroup" xmlns:wpi="http://schemas.microsoft.com/office/word/2010/wordprocessingInk" xmlns:wne="http://schemas.microsoft.com/office/word/2006/wordml" xmlns:wps="http://schemas.microsoft.com/office/word/2010/wordprocessingShape" mc:Ignorable="w14 w15 w16se w16cid w16 w16cex w16sdtdh w16sdtfl w16du wp14">
   <w:abstractNum w:abstractNumId="0" w15:restartNumberingAfterBreak="0">
     <w:nsid w:val="03D369E5"/>
     <w:multiLevelType w:val="multilevel"/>
@@ -37329,7 +36846,7 @@
 </file>
 
 <file path=word/styles.xml><?xml version="1.0" encoding="utf-8"?>
-<w:styles xmlns:mc="http://schemas.openxmlformats.org/markup-compatibility/2006" xmlns:r="http://schemas.openxmlformats.org/officeDocument/2006/relationships" xmlns:w="http://schemas.openxmlformats.org/wordprocessingml/2006/main" xmlns:w14="http://schemas.microsoft.com/office/word/2010/wordml" xmlns:w15="http://schemas.microsoft.com/office/word/2012/wordml" xmlns:w16cex="http://schemas.microsoft.com/office/word/2018/wordml/cex" xmlns:w16cid="http://schemas.microsoft.com/office/word/2016/wordml/cid" xmlns:w16="http://schemas.microsoft.com/office/word/2018/wordml" xmlns:w16du="http://schemas.microsoft.com/office/word/2023/wordml/word16du" xmlns:w16sdtdh="http://schemas.microsoft.com/office/word/2020/wordml/sdtdatahash" xmlns:w16se="http://schemas.microsoft.com/office/word/2015/wordml/symex" mc:Ignorable="w14 w15 w16se w16cid w16 w16cex w16sdtdh w16du">
+<w:styles xmlns:mc="http://schemas.openxmlformats.org/markup-compatibility/2006" xmlns:r="http://schemas.openxmlformats.org/officeDocument/2006/relationships" xmlns:w="http://schemas.openxmlformats.org/wordprocessingml/2006/main" xmlns:w14="http://schemas.microsoft.com/office/word/2010/wordml" xmlns:w15="http://schemas.microsoft.com/office/word/2012/wordml" xmlns:w16cex="http://schemas.microsoft.com/office/word/2018/wordml/cex" xmlns:w16cid="http://schemas.microsoft.com/office/word/2016/wordml/cid" xmlns:w16="http://schemas.microsoft.com/office/word/2018/wordml" xmlns:w16du="http://schemas.microsoft.com/office/word/2023/wordml/word16du" xmlns:w16sdtdh="http://schemas.microsoft.com/office/word/2020/wordml/sdtdatahash" xmlns:w16sdtfl="http://schemas.microsoft.com/office/word/2024/wordml/sdtformatlock" xmlns:w16se="http://schemas.microsoft.com/office/word/2015/wordml/symex" mc:Ignorable="w14 w15 w16se w16cid w16 w16cex w16sdtdh w16sdtfl w16du">
   <w:docDefaults>
     <w:rPrDefault>
       <w:rPr>
@@ -37929,6 +37446,7 @@
   <w:style w:type="character" w:default="1" w:styleId="DefaultParagraphFont">
     <w:name w:val="Default Paragraph Font"/>
     <w:uiPriority w:val="1"/>
+    <w:semiHidden/>
     <w:unhideWhenUsed/>
   </w:style>
   <w:style w:type="table" w:default="1" w:styleId="TableNormal">

</xml_diff>